<commit_message>
Atualização tecnológica: substituição do sensor DHT22 pelo sensor Sensirion SHT31-D (I2C)
</commit_message>
<xml_diff>
--- a/01_Submissao_CEP_Palmilha_PPC/05_TCLE_Adulto_Palmilha_Inteligente.docx
+++ b/01_Submissao_CEP_Palmilha_PPC/05_TCLE_Adulto_Palmilha_Inteligente.docx
@@ -85,7 +85,7 @@
           <w:color w:val="000000"/>
           <w:sz w:val="19"/>
         </w:rPr>
-        <w:t>O objetivo deste estudo é avaliar se uma palmilha inteligente inovadora (desenvolvida com sensores eletrônicos de baixo custo capazes de medir simultaneamente a pressão em pontos críticos da sola do pé, a temperatura e a umidade interna do calçado) funciona de maneira precisa quando comparada a uma esteira eletrônica de pressão (baropodômetro), já utilizada na Policlínica Piquet Carneiro. O estudo busca contribuir diretamente para a prevenção precoce de feridas (úlceras) e amputações em pessoas com Diabetes Mellitus atendidas no SUS.</w:t>
+        <w:t>O objetivo deste estudo é avaliar se uma palmilha inteligente inovadora (desenvolvida com sensores eletrônicos de baixo custo capazes de medir simultaneamente a pressão em pontos críticos da sola do pé, e sensor digital de alta precisão Sensirion SHT31-D para temperatura e umidade relativa interna do calçado) funciona de maneira precisa quando comparada a uma esteira eletrônica de pressão (baropodômetro), já utilizada na Policlínica Piquet Carneiro. O estudo busca contribuir diretamente para a prevenção precoce de feridas (úlceras) e amputações em pessoas com Diabetes Mellitus atendidas no SUS.</w:t>
       </w:r>
     </w:p>
     <w:p>
@@ -157,7 +157,7 @@
         <w:br/>
         <w:t>• Risco de leve cansaço ou desequilíbrio durante os passos: Para evitar qualquer tropeço, a caminhada é de curta distância em piso totalmente plano, sempre supervisionada de perto pelo pesquisador, que estará ao seu lado pronto para dar apoio físico.</w:t>
         <w:br/>
-        <w:t>• Segurança Elétrica e Ergonômica: O módulo de processamento eletrônico (Wemos Lolin D32) é ultraleve (pesa apenas 7,5 gramas) e é alimentado por uma pequena bateria recarregável plana de Polímero de Lítio (LiPo 3,7V e 600mAh), equipada com conector polarizado de segurança JST PH 2.0mm. Trata-se de uma voltagem extremamente baixa (semelhante à de fones de ouvido sem fio), com circuito de proteção que elimina qualquer possibilidade de choque elétrico, curto-circuito ou aquecimento.</w:t>
+        <w:t>• Segurança Elétrica e Ergonômica: O módulo de processamento eletrônico (Wemos Lolin D32) é ultraleve (pesa apenas 7,5 gramas) e é alimentado por uma pequena bateria recarregável plana de Polímero de Lítio (LiPo 3,7V e 600mAh), equipada com conector polarizado de segurança JST PH 2.0mm. O sensor térmico e de umidade (Sensirion SHT31-D) é ultraplano e miniaturizado, não causando pontos de atrito ou pressão na sola do pé. Trata-se de uma voltagem extremamente baixa, com circuito de proteção que elimina qualquer possibilidade de choque elétrico, curto-circuito ou aquecimento.</w:t>
         <w:br/>
         <w:t>• Biossegurança e Higiene: A palmilha é rigorosamente higienizada e desinfetada com álcool a 70% antes e após cada participante, além do uso obrigatório de meia protetora descartável de uso individual.</w:t>
         <w:br/>

</xml_diff>

<commit_message>
feat: add CEP submission documents, TCLE, and data collection instruments
</commit_message>
<xml_diff>
--- a/01_Submissao_CEP_Palmilha_PPC/05_TCLE_Adulto_Palmilha_Inteligente.docx
+++ b/01_Submissao_CEP_Palmilha_PPC/05_TCLE_Adulto_Palmilha_Inteligente.docx
@@ -1,10 +1,10 @@
 
 <file path=word/document.xml><?xml version="1.0" encoding="utf-8"?>
-<w:document xmlns:wpc="http://schemas.microsoft.com/office/word/2010/wordprocessingCanvas" xmlns:mo="http://schemas.microsoft.com/office/mac/office/2008/main" xmlns:mc="http://schemas.openxmlformats.org/markup-compatibility/2006" xmlns:mv="urn:schemas-microsoft-com:mac:vml" xmlns:o="urn:schemas-microsoft-com:office:office" xmlns:r="http://schemas.openxmlformats.org/officeDocument/2006/relationships" xmlns:m="http://schemas.openxmlformats.org/officeDocument/2006/math" xmlns:v="urn:schemas-microsoft-com:vml" xmlns:wp14="http://schemas.microsoft.com/office/word/2010/wordprocessingDrawing" xmlns:wp="http://schemas.openxmlformats.org/drawingml/2006/wordprocessingDrawing" xmlns:w10="urn:schemas-microsoft-com:office:word" xmlns:w="http://schemas.openxmlformats.org/wordprocessingml/2006/main" xmlns:w14="http://schemas.microsoft.com/office/word/2010/wordml" xmlns:wpg="http://schemas.microsoft.com/office/word/2010/wordprocessingGroup" xmlns:wpi="http://schemas.microsoft.com/office/word/2010/wordprocessingInk" xmlns:wne="http://schemas.microsoft.com/office/word/2006/wordml" xmlns:wps="http://schemas.microsoft.com/office/word/2010/wordprocessingShape" mc:Ignorable="w14 wp14">
+<w:document xmlns:ve="http://schemas.openxmlformats.org/markup-compatibility/2006" xmlns:o="urn:schemas-microsoft-com:office:office" xmlns:r="http://schemas.openxmlformats.org/officeDocument/2006/relationships" xmlns:m="http://schemas.openxmlformats.org/officeDocument/2006/math" xmlns:v="urn:schemas-microsoft-com:vml" xmlns:wp="http://schemas.openxmlformats.org/drawingml/2006/wordprocessingDrawing" xmlns:w10="urn:schemas-microsoft-com:office:word" xmlns:w="http://schemas.openxmlformats.org/wordprocessingml/2006/main" xmlns:wne="http://schemas.microsoft.com/office/word/2006/wordml">
   <w:body>
     <w:p>
       <w:pPr>
-        <w:spacing w:before="0" w:after="80" w:line="240" w:lineRule="auto"/>
+        <w:spacing w:after="80" w:line="240" w:lineRule="auto"/>
         <w:jc w:val="center"/>
       </w:pPr>
       <w:r>
@@ -14,8 +14,22 @@
           <w:sz w:val="18"/>
         </w:rPr>
         <w:t>UNIVERSIDADE DO ESTADO DO RIO DE JANEIRO – UERJ</w:t>
+      </w:r>
+      <w:r>
+        <w:rPr>
+          <w:rFonts w:ascii="Arial" w:hAnsi="Arial"/>
+          <w:b/>
+          <w:sz w:val="18"/>
+        </w:rPr>
         <w:br/>
         <w:t>HOSPITAL UNIVERSITÁRIO PEDRO ERNESTO – HUPE</w:t>
+      </w:r>
+      <w:r>
+        <w:rPr>
+          <w:rFonts w:ascii="Arial" w:hAnsi="Arial"/>
+          <w:b/>
+          <w:sz w:val="18"/>
+        </w:rPr>
         <w:br/>
         <w:t>COMITÊ DE ÉTICA EM PESQUISA (CEP/HUPE)</w:t>
       </w:r>
@@ -36,33 +50,174 @@
     </w:p>
     <w:p>
       <w:pPr>
-        <w:spacing w:before="0" w:after="160" w:line="240" w:lineRule="auto"/>
-        <w:jc w:val="right"/>
-      </w:pPr>
-      <w:r>
+        <w:spacing w:before="80" w:after="120" w:line="300" w:lineRule="auto"/>
         <w:rPr>
           <w:rFonts w:ascii="Arial" w:hAnsi="Arial"/>
           <w:i/>
           <w:sz w:val="16"/>
         </w:rPr>
-        <w:t>Versão desse documento datado de 01/06/2026</w:t>
-      </w:r>
+      </w:pPr>
     </w:p>
     <w:p>
       <w:pPr>
         <w:spacing w:before="80" w:after="120" w:line="300" w:lineRule="auto"/>
-        <w:jc w:val="both"/>
+        <w:ind w:firstLine="720"/>
       </w:pPr>
+      <w:proofErr w:type="spellStart"/>
       <w:r>
-        <w:t>Você está sendo convidado(a) a participar como voluntário(a) da pesquisa científica intitulada “Arquitetura de baixo custo para monitoramento preventivo do pé diabético: calibração com baropodômetro e prova de conceito na Policlínica Piquet Carneiro”, realizada no âmbito do Programa de Pós-Graduação em Telessaúde e Saúde Digital (PPGTSD) da Faculdade de Ciências Médicas da Universidade do Estado do Rio de Janeiro (UERJ), que diz respeito à Dissertação de Mestrado Profissional do pesquisador Chrysthian Chrisley Tadeu Santos Silva, sob orientação da Prof.ª Dra. Rosa Maria Esteves Moreira da Costa.</w:t>
+        <w:t>Você</w:t>
+      </w:r>
+      <w:proofErr w:type="spellEnd"/>
+      <w:r>
+        <w:t xml:space="preserve"> </w:t>
+      </w:r>
+      <w:proofErr w:type="spellStart"/>
+      <w:r>
+        <w:t>está</w:t>
+      </w:r>
+      <w:proofErr w:type="spellEnd"/>
+      <w:r>
+        <w:t xml:space="preserve"> </w:t>
+      </w:r>
+      <w:proofErr w:type="spellStart"/>
+      <w:r>
+        <w:t>sendo</w:t>
+      </w:r>
+      <w:proofErr w:type="spellEnd"/>
+      <w:r>
+        <w:t xml:space="preserve"> </w:t>
+      </w:r>
+      <w:proofErr w:type="spellStart"/>
+      <w:r>
+        <w:t>convidado</w:t>
+      </w:r>
+      <w:proofErr w:type="spellEnd"/>
+      <w:r>
+        <w:t xml:space="preserve">(a) a participar como voluntário(a) da </w:t>
+      </w:r>
+      <w:proofErr w:type="spellStart"/>
+      <w:r>
+        <w:t>pesquisa</w:t>
+      </w:r>
+      <w:proofErr w:type="spellEnd"/>
+      <w:r>
+        <w:t xml:space="preserve"> </w:t>
+      </w:r>
+      <w:proofErr w:type="spellStart"/>
+      <w:r>
+        <w:t>científica</w:t>
+      </w:r>
+      <w:proofErr w:type="spellEnd"/>
+      <w:r>
+        <w:t xml:space="preserve"> </w:t>
+      </w:r>
+      <w:proofErr w:type="spellStart"/>
+      <w:r>
+        <w:t>intitulada</w:t>
+      </w:r>
+      <w:proofErr w:type="spellEnd"/>
+      <w:r>
+        <w:t xml:space="preserve"> </w:t>
+      </w:r>
+      <w:r>
+        <w:t>“</w:t>
+      </w:r>
+      <w:proofErr w:type="spellStart"/>
+      <w:r>
+        <w:t>Arquitetura</w:t>
+      </w:r>
+      <w:proofErr w:type="spellEnd"/>
+      <w:r>
+        <w:t xml:space="preserve"> de </w:t>
+      </w:r>
+      <w:proofErr w:type="spellStart"/>
+      <w:r>
+        <w:t>baixo</w:t>
+      </w:r>
+      <w:proofErr w:type="spellEnd"/>
+      <w:r>
+        <w:t xml:space="preserve"> </w:t>
+      </w:r>
+      <w:proofErr w:type="spellStart"/>
+      <w:r>
+        <w:t>custo</w:t>
+      </w:r>
+      <w:proofErr w:type="spellEnd"/>
+      <w:r>
+        <w:t xml:space="preserve"> para monitoramento preventivo do pé diabético: calibração com baropodômetro e prova de conceito na Policlínica Piquet Carneiro”, realizada no âmbito </w:t>
+      </w:r>
+      <w:r>
+        <w:t>do Programa de Pós-Graduação em Telessaúde e Saúde Digital (PPGTSD) da Faculdade de Ciências Médicas da Universidade do Estado do Rio de Janeiro (UERJ), que diz respeito à Dissertação de Mestrado Profissional do pesquisador Chrysthian Chrisley Tadeu Santos</w:t>
+      </w:r>
+      <w:r>
+        <w:t xml:space="preserve"> Silva, sob orientação da Prof.ª Dra. Rosa Maria Esteves Moreira da Costa.</w:t>
+      </w:r>
+      <w:r>
         <w:br/>
+      </w:r>
+      <w:r>
         <w:br/>
-        <w:t>Antes de decidir se aceita participar, é fundamental que você compreenda todas as informações a seguir. Leia com calma, tire todas as dúvidas que desejar e sinta-se plenamente livre para aceitar ou recusar.</w:t>
       </w:r>
+      <w:proofErr w:type="gramStart"/>
+      <w:r>
+        <w:t xml:space="preserve">Antes de </w:t>
+      </w:r>
+      <w:proofErr w:type="spellStart"/>
+      <w:r>
+        <w:t>decidir</w:t>
+      </w:r>
+      <w:proofErr w:type="spellEnd"/>
+      <w:r>
+        <w:t xml:space="preserve"> se aceita participar, é fundamental que você compreenda todas as informações a seguir.</w:t>
+      </w:r>
+      <w:proofErr w:type="gramEnd"/>
+      <w:r>
+        <w:t xml:space="preserve"> </w:t>
+      </w:r>
+      <w:proofErr w:type="gramStart"/>
+      <w:r>
+        <w:t>Leia com calma, tire todas as dúvidas que desejar e sinta-se plenamente livr</w:t>
+      </w:r>
+      <w:r>
+        <w:t xml:space="preserve">e </w:t>
+      </w:r>
+      <w:proofErr w:type="spellStart"/>
+      <w:r>
+        <w:t>para</w:t>
+      </w:r>
+      <w:proofErr w:type="spellEnd"/>
+      <w:r>
+        <w:t xml:space="preserve"> </w:t>
+      </w:r>
+      <w:proofErr w:type="spellStart"/>
+      <w:r>
+        <w:t>aceitar</w:t>
+      </w:r>
+      <w:proofErr w:type="spellEnd"/>
+      <w:r>
+        <w:t xml:space="preserve"> </w:t>
+      </w:r>
+      <w:proofErr w:type="spellStart"/>
+      <w:r>
+        <w:t>ou</w:t>
+      </w:r>
+      <w:proofErr w:type="spellEnd"/>
+      <w:r>
+        <w:t xml:space="preserve"> </w:t>
+      </w:r>
+      <w:proofErr w:type="spellStart"/>
+      <w:r>
+        <w:t>recusar</w:t>
+      </w:r>
+      <w:proofErr w:type="spellEnd"/>
+      <w:r>
+        <w:t>.</w:t>
+      </w:r>
+      <w:proofErr w:type="gramEnd"/>
     </w:p>
     <w:p>
       <w:pPr>
-        <w:spacing w:before="120" w:after="40" w:line="276" w:lineRule="auto"/>
+        <w:spacing w:before="120" w:after="40"/>
       </w:pPr>
       <w:r>
         <w:rPr>
@@ -85,12 +240,28 @@
           <w:color w:val="000000"/>
           <w:sz w:val="19"/>
         </w:rPr>
-        <w:t>O objetivo deste estudo é avaliar se uma palmilha inteligente inovadora (desenvolvida com sensores eletrônicos de baixo custo capazes de medir simultaneamente a pressão em pontos críticos da sola do pé, e sensor digital de alta precisão Sensirion SHT31-D para temperatura e umidade relativa interna do calçado) funciona de maneira precisa quando comparada a uma esteira eletrônica de pressão (baropodômetro), já utilizada na Policlínica Piquet Carneiro. O estudo busca contribuir diretamente para a prevenção precoce de feridas (úlceras) e amputações em pessoas com Diabetes Mellitus atendidas no SUS.</w:t>
+        <w:t>O objetivo deste estudo é avaliar se uma palmilha inteligente inovadora (desenvolvida com sensores eletrônicos de baixo custo capazes de medir simultaneamente a pressão em pontos críticos da sola do pé, e se</w:t>
+      </w:r>
+      <w:r>
+        <w:rPr>
+          <w:rFonts w:ascii="Arial" w:hAnsi="Arial"/>
+          <w:color w:val="000000"/>
+          <w:sz w:val="19"/>
+        </w:rPr>
+        <w:t xml:space="preserve">nsor digital de alta precisão Sensirion SHT31-D para temperatura e umidade relativa interna do calçado) funciona de maneira precisa quando comparada a uma esteira eletrônica de pressão (baropodômetro), já utilizada na Policlínica Piquet Carneiro. O estudo </w:t>
+      </w:r>
+      <w:r>
+        <w:rPr>
+          <w:rFonts w:ascii="Arial" w:hAnsi="Arial"/>
+          <w:color w:val="000000"/>
+          <w:sz w:val="19"/>
+        </w:rPr>
+        <w:t>busca contribuir diretamente para a prevenção precoce de feridas (úlceras) e amputações em pessoas com Diabetes Mellitus atendidas no SUS.</w:t>
       </w:r>
     </w:p>
     <w:p>
       <w:pPr>
-        <w:spacing w:before="120" w:after="40" w:line="276" w:lineRule="auto"/>
+        <w:spacing w:before="120" w:after="40"/>
       </w:pPr>
       <w:r>
         <w:rPr>
@@ -105,7 +276,11 @@
     <w:p>
       <w:pPr>
         <w:spacing w:before="20" w:after="80" w:line="288" w:lineRule="auto"/>
-        <w:jc w:val="both"/>
+        <w:rPr>
+          <w:rFonts w:ascii="Arial" w:hAnsi="Arial"/>
+          <w:color w:val="000000"/>
+          <w:sz w:val="19"/>
+        </w:rPr>
       </w:pPr>
       <w:r>
         <w:rPr>
@@ -113,24 +288,175 @@
           <w:color w:val="000000"/>
           <w:sz w:val="19"/>
         </w:rPr>
-        <w:t>A sua participação ocorrerá em uma única sessão presencial de cerca de 20 a 30 minutos na Policlínica Piquet Carneiro (PPC/UERJ):</w:t>
-        <w:br/>
-        <w:t>a) Inicialmente, você responderá a perguntas simples sobre sua saúde, tempo de diabetes e numeração do seu calçado;</w:t>
-        <w:br/>
-        <w:t>b) Você receberá uma meia de proteção descartável nova e calçará um calçado confortável contendo a palmilha inteligente instrumentada;</w:t>
-        <w:br/>
-        <w:t>c) Você realizará uma caminhada curta e confortável sobre a esteira de baropodometria, primeiro ficando parado em pé por cerca de 10 segundos e depois caminhando em linha reta em ritmo normal;</w:t>
-        <w:br/>
-        <w:t>d) Durante a caminhada, os sensores registrarão automaticamente a distribuição da pressão do seu pé, a temperatura e a umidade interna;</w:t>
-        <w:br/>
-        <w:t>e) Ao final, você responderá a um breve questionário opinando se achou a palmilha confortável, leve e estável para caminhar.</w:t>
-        <w:br/>
-        <w:t>Todo o procedimento é totalmente indolor, não invasivo, sem agulhas e sem uso de qualquer medicamento.</w:t>
+        <w:t>A sua participação ocorrerá em uma única sessão presencial de cerca d</w:t>
+      </w:r>
+      <w:r>
+        <w:rPr>
+          <w:rFonts w:ascii="Arial" w:hAnsi="Arial"/>
+          <w:color w:val="000000"/>
+          <w:sz w:val="19"/>
+        </w:rPr>
+        <w:t xml:space="preserve">e 20 a 30 minutos </w:t>
+      </w:r>
+      <w:proofErr w:type="gramStart"/>
+      <w:r>
+        <w:rPr>
+          <w:rFonts w:ascii="Arial" w:hAnsi="Arial"/>
+          <w:color w:val="000000"/>
+          <w:sz w:val="19"/>
+        </w:rPr>
+        <w:t>na</w:t>
+      </w:r>
+      <w:proofErr w:type="gramEnd"/>
+      <w:r>
+        <w:rPr>
+          <w:rFonts w:ascii="Arial" w:hAnsi="Arial"/>
+          <w:color w:val="000000"/>
+          <w:sz w:val="19"/>
+        </w:rPr>
+        <w:t xml:space="preserve"> </w:t>
+      </w:r>
+      <w:proofErr w:type="spellStart"/>
+      <w:r>
+        <w:rPr>
+          <w:rFonts w:ascii="Arial" w:hAnsi="Arial"/>
+          <w:color w:val="000000"/>
+          <w:sz w:val="19"/>
+        </w:rPr>
+        <w:t>Policlínica</w:t>
+      </w:r>
+      <w:proofErr w:type="spellEnd"/>
+      <w:r>
+        <w:rPr>
+          <w:rFonts w:ascii="Arial" w:hAnsi="Arial"/>
+          <w:color w:val="000000"/>
+          <w:sz w:val="19"/>
+        </w:rPr>
+        <w:t xml:space="preserve"> Piquet </w:t>
+      </w:r>
+      <w:proofErr w:type="spellStart"/>
+      <w:r>
+        <w:rPr>
+          <w:rFonts w:ascii="Arial" w:hAnsi="Arial"/>
+          <w:color w:val="000000"/>
+          <w:sz w:val="19"/>
+        </w:rPr>
+        <w:t>Carneiro</w:t>
+      </w:r>
+      <w:proofErr w:type="spellEnd"/>
+      <w:r>
+        <w:rPr>
+          <w:rFonts w:ascii="Arial" w:hAnsi="Arial"/>
+          <w:color w:val="000000"/>
+          <w:sz w:val="19"/>
+        </w:rPr>
+        <w:t xml:space="preserve"> (PPC/UERJ):</w:t>
       </w:r>
     </w:p>
     <w:p>
       <w:pPr>
-        <w:spacing w:before="120" w:after="40" w:line="276" w:lineRule="auto"/>
+        <w:spacing w:before="20" w:after="80" w:line="288" w:lineRule="auto"/>
+      </w:pPr>
+      <w:r>
+        <w:rPr>
+          <w:rFonts w:ascii="Arial" w:hAnsi="Arial"/>
+          <w:color w:val="000000"/>
+          <w:sz w:val="19"/>
+        </w:rPr>
+        <w:br/>
+        <w:t>a) Inicialmente, você responderá a perguntas simples sobre sua saúde, tempo de diabetes e numeração do seu calçado;</w:t>
+      </w:r>
+      <w:r>
+        <w:rPr>
+          <w:rFonts w:ascii="Arial" w:hAnsi="Arial"/>
+          <w:color w:val="000000"/>
+          <w:sz w:val="19"/>
+        </w:rPr>
+        <w:br/>
+        <w:t>b) Você receberá uma meia de proteção descartável nova e calçará um calçado con</w:t>
+      </w:r>
+      <w:r>
+        <w:rPr>
+          <w:rFonts w:ascii="Arial" w:hAnsi="Arial"/>
+          <w:color w:val="000000"/>
+          <w:sz w:val="19"/>
+        </w:rPr>
+        <w:t>fortável contendo a palmilha inteligente instrumentada;</w:t>
+      </w:r>
+      <w:r>
+        <w:rPr>
+          <w:rFonts w:ascii="Arial" w:hAnsi="Arial"/>
+          <w:color w:val="000000"/>
+          <w:sz w:val="19"/>
+        </w:rPr>
+        <w:br/>
+        <w:t>c) Você realizará uma caminhada curta e confortável sobre a esteira de baropodometria, primeiro ficando parado em pé por cerca de 10 segundos e depois caminhando em linha reta em ritmo normal;</w:t>
+      </w:r>
+      <w:r>
+        <w:rPr>
+          <w:rFonts w:ascii="Arial" w:hAnsi="Arial"/>
+          <w:color w:val="000000"/>
+          <w:sz w:val="19"/>
+        </w:rPr>
+        <w:br/>
+        <w:t>d) Dura</w:t>
+      </w:r>
+      <w:r>
+        <w:rPr>
+          <w:rFonts w:ascii="Arial" w:hAnsi="Arial"/>
+          <w:color w:val="000000"/>
+          <w:sz w:val="19"/>
+        </w:rPr>
+        <w:t>nte a caminhada, os sensores registrarão automaticamente a distribuição da pressão do seu pé, a temperatura e a umidade interna;</w:t>
+      </w:r>
+      <w:r>
+        <w:rPr>
+          <w:rFonts w:ascii="Arial" w:hAnsi="Arial"/>
+          <w:color w:val="000000"/>
+          <w:sz w:val="19"/>
+        </w:rPr>
+        <w:br/>
+        <w:t>e) Ao final, você responderá a um breve questionário opinando se achou a palmilha confortável, leve e estável para caminhar.</w:t>
+      </w:r>
+      <w:r>
+        <w:rPr>
+          <w:rFonts w:ascii="Arial" w:hAnsi="Arial"/>
+          <w:color w:val="000000"/>
+          <w:sz w:val="19"/>
+        </w:rPr>
+        <w:br/>
+        <w:t>To</w:t>
+      </w:r>
+      <w:r>
+        <w:rPr>
+          <w:rFonts w:ascii="Arial" w:hAnsi="Arial"/>
+          <w:color w:val="000000"/>
+          <w:sz w:val="19"/>
+        </w:rPr>
+        <w:t xml:space="preserve">do o procedimento é totalmente indolor, não invasivo, </w:t>
+      </w:r>
+      <w:proofErr w:type="gramStart"/>
+      <w:r>
+        <w:rPr>
+          <w:rFonts w:ascii="Arial" w:hAnsi="Arial"/>
+          <w:color w:val="000000"/>
+          <w:sz w:val="19"/>
+        </w:rPr>
+        <w:t>sem</w:t>
+      </w:r>
+      <w:proofErr w:type="gramEnd"/>
+      <w:r>
+        <w:rPr>
+          <w:rFonts w:ascii="Arial" w:hAnsi="Arial"/>
+          <w:color w:val="000000"/>
+          <w:sz w:val="19"/>
+        </w:rPr>
+        <w:t xml:space="preserve"> agulhas e sem uso de qualquer medicamento.</w:t>
+      </w:r>
+    </w:p>
+    <w:p>
+      <w:pPr>
+        <w:spacing w:before="120" w:after="40"/>
       </w:pPr>
       <w:r>
         <w:rPr>
@@ -145,7 +471,6 @@
     <w:p>
       <w:pPr>
         <w:spacing w:before="20" w:after="80" w:line="288" w:lineRule="auto"/>
-        <w:jc w:val="both"/>
       </w:pPr>
       <w:r>
         <w:rPr>
@@ -154,19 +479,212 @@
           <w:sz w:val="19"/>
         </w:rPr>
         <w:t>Os riscos envolvidos nesta pesquisa são considerados MÍNIMOS:</w:t>
+      </w:r>
+      <w:r>
+        <w:rPr>
+          <w:rFonts w:ascii="Arial" w:hAnsi="Arial"/>
+          <w:color w:val="000000"/>
+          <w:sz w:val="19"/>
+        </w:rPr>
         <w:br/>
-        <w:t>• Risco de leve cansaço ou desequilíbrio durante os passos: Para evitar qualquer tropeço, a caminhada é de curta distância em piso totalmente plano, sempre supervisionada de perto pelo pesquisador, que estará ao seu lado pronto para dar apoio físico.</w:t>
+        <w:t xml:space="preserve">• Risco de leve cansaço ou desequilíbrio durante </w:t>
+      </w:r>
+      <w:r>
+        <w:rPr>
+          <w:rFonts w:ascii="Arial" w:hAnsi="Arial"/>
+          <w:color w:val="000000"/>
+          <w:sz w:val="19"/>
+        </w:rPr>
+        <w:t>os passos: Para evitar qualquer tropeço, a caminhada é de curta distância em piso totalmente plano, sempre supervisionada de perto pelo pesquisador, que estará ao seu lado pronto para dar apoio físico.</w:t>
+      </w:r>
+      <w:r>
+        <w:rPr>
+          <w:rFonts w:ascii="Arial" w:hAnsi="Arial"/>
+          <w:color w:val="000000"/>
+          <w:sz w:val="19"/>
+        </w:rPr>
         <w:br/>
-        <w:t>• Segurança Elétrica e Ergonômica: O módulo de processamento eletrônico (Wemos Lolin D32) é ultraleve (pesa apenas 7,5 gramas) e é alimentado por uma pequena bateria recarregável plana de Polímero de Lítio (LiPo 3,7V e 600mAh), equipada com conector polarizado de segurança JST PH 2.0mm. O sensor térmico e de umidade (Sensirion SHT31-D) é ultraplano e miniaturizado, não causando pontos de atrito ou pressão na sola do pé. Trata-se de uma voltagem extremamente baixa, com circuito de proteção que elimina qualquer possibilidade de choque elétrico, curto-circuito ou aquecimento.</w:t>
+        <w:t>• Segurança Elétrica e Ergonômica: O módulo de process</w:t>
+      </w:r>
+      <w:r>
+        <w:rPr>
+          <w:rFonts w:ascii="Arial" w:hAnsi="Arial"/>
+          <w:color w:val="000000"/>
+          <w:sz w:val="19"/>
+        </w:rPr>
+        <w:t xml:space="preserve">amento eletrônico (Wemos Lolin D32) é ultraleve (pesa apenas 7,5 gramas) e é alimentado por uma pequena bateria recarregável plana de Polímero de Lítio (LiPo 3,7V e 600mAh), equipada com conector polarizado de segurança JST PH 2.0mm. O sensor térmico e de </w:t>
+      </w:r>
+      <w:proofErr w:type="spellStart"/>
+      <w:r>
+        <w:rPr>
+          <w:rFonts w:ascii="Arial" w:hAnsi="Arial"/>
+          <w:color w:val="000000"/>
+          <w:sz w:val="19"/>
+        </w:rPr>
+        <w:t>umidade</w:t>
+      </w:r>
+      <w:proofErr w:type="spellEnd"/>
+      <w:r>
+        <w:rPr>
+          <w:rFonts w:ascii="Arial" w:hAnsi="Arial"/>
+          <w:color w:val="000000"/>
+          <w:sz w:val="19"/>
+        </w:rPr>
+        <w:t xml:space="preserve"> </w:t>
+      </w:r>
+      <w:r>
+        <w:rPr>
+          <w:rFonts w:ascii="Arial" w:hAnsi="Arial"/>
+          <w:color w:val="000000"/>
+          <w:sz w:val="19"/>
+        </w:rPr>
+        <w:lastRenderedPageBreak/>
+        <w:t>(</w:t>
+      </w:r>
+      <w:r>
+        <w:rPr>
+          <w:rFonts w:ascii="Arial" w:hAnsi="Arial"/>
+          <w:color w:val="000000"/>
+          <w:sz w:val="19"/>
+        </w:rPr>
+        <w:t>SHT31</w:t>
+      </w:r>
+      <w:r>
+        <w:rPr>
+          <w:rFonts w:ascii="Arial" w:hAnsi="Arial"/>
+          <w:color w:val="000000"/>
+          <w:sz w:val="19"/>
+        </w:rPr>
+        <w:t xml:space="preserve">) é </w:t>
+      </w:r>
+      <w:proofErr w:type="spellStart"/>
+      <w:r>
+        <w:rPr>
+          <w:rFonts w:ascii="Arial" w:hAnsi="Arial"/>
+          <w:color w:val="000000"/>
+          <w:sz w:val="19"/>
+        </w:rPr>
+        <w:t>miniaturizado</w:t>
+      </w:r>
+      <w:proofErr w:type="spellEnd"/>
+      <w:r>
+        <w:rPr>
+          <w:rFonts w:ascii="Arial" w:hAnsi="Arial"/>
+          <w:color w:val="000000"/>
+          <w:sz w:val="19"/>
+        </w:rPr>
+        <w:t xml:space="preserve">, </w:t>
+      </w:r>
+      <w:proofErr w:type="spellStart"/>
+      <w:r>
+        <w:rPr>
+          <w:rFonts w:ascii="Arial" w:hAnsi="Arial"/>
+          <w:color w:val="000000"/>
+          <w:sz w:val="19"/>
+        </w:rPr>
+        <w:t>não</w:t>
+      </w:r>
+      <w:proofErr w:type="spellEnd"/>
+      <w:r>
+        <w:rPr>
+          <w:rFonts w:ascii="Arial" w:hAnsi="Arial"/>
+          <w:color w:val="000000"/>
+          <w:sz w:val="19"/>
+        </w:rPr>
+        <w:t xml:space="preserve"> </w:t>
+      </w:r>
+      <w:proofErr w:type="spellStart"/>
+      <w:r>
+        <w:rPr>
+          <w:rFonts w:ascii="Arial" w:hAnsi="Arial"/>
+          <w:color w:val="000000"/>
+          <w:sz w:val="19"/>
+        </w:rPr>
+        <w:t>causando</w:t>
+      </w:r>
+      <w:proofErr w:type="spellEnd"/>
+      <w:r>
+        <w:rPr>
+          <w:rFonts w:ascii="Arial" w:hAnsi="Arial"/>
+          <w:color w:val="000000"/>
+          <w:sz w:val="19"/>
+        </w:rPr>
+        <w:t xml:space="preserve"> </w:t>
+      </w:r>
+      <w:proofErr w:type="spellStart"/>
+      <w:r>
+        <w:rPr>
+          <w:rFonts w:ascii="Arial" w:hAnsi="Arial"/>
+          <w:color w:val="000000"/>
+          <w:sz w:val="19"/>
+        </w:rPr>
+        <w:t>pontos</w:t>
+      </w:r>
+      <w:proofErr w:type="spellEnd"/>
+      <w:r>
+        <w:rPr>
+          <w:rFonts w:ascii="Arial" w:hAnsi="Arial"/>
+          <w:color w:val="000000"/>
+          <w:sz w:val="19"/>
+        </w:rPr>
+        <w:t xml:space="preserve"> de atrito ou pressão </w:t>
+      </w:r>
+      <w:proofErr w:type="gramStart"/>
+      <w:r>
+        <w:rPr>
+          <w:rFonts w:ascii="Arial" w:hAnsi="Arial"/>
+          <w:color w:val="000000"/>
+          <w:sz w:val="19"/>
+        </w:rPr>
+        <w:t>na</w:t>
+      </w:r>
+      <w:proofErr w:type="gramEnd"/>
+      <w:r>
+        <w:rPr>
+          <w:rFonts w:ascii="Arial" w:hAnsi="Arial"/>
+          <w:color w:val="000000"/>
+          <w:sz w:val="19"/>
+        </w:rPr>
+        <w:t xml:space="preserve"> sola do pé. Trata-se de uma voltagem extremamente baixa, com circuito de proteção que elimina qualquer possibilidade de choque elétrico, curto-circuito ou</w:t>
+      </w:r>
+      <w:r>
+        <w:rPr>
+          <w:rFonts w:ascii="Arial" w:hAnsi="Arial"/>
+          <w:color w:val="000000"/>
+          <w:sz w:val="19"/>
+        </w:rPr>
+        <w:t xml:space="preserve"> aquecimento.</w:t>
+      </w:r>
+      <w:r>
+        <w:rPr>
+          <w:rFonts w:ascii="Arial" w:hAnsi="Arial"/>
+          <w:color w:val="000000"/>
+          <w:sz w:val="19"/>
+        </w:rPr>
         <w:br/>
         <w:t>• Biossegurança e Higiene: A palmilha é rigorosamente higienizada e desinfetada com álcool a 70% antes e após cada participante, além do uso obrigatório de meia protetora descartável de uso individual.</w:t>
+      </w:r>
+      <w:r>
+        <w:rPr>
+          <w:rFonts w:ascii="Arial" w:hAnsi="Arial"/>
+          <w:color w:val="000000"/>
+          <w:sz w:val="19"/>
+        </w:rPr>
         <w:br/>
-        <w:t>Você pode solicitar a interrupção imediata do teste a qualquer instante caso sinta qualquer incômodo.</w:t>
+        <w:t>Você pode solicitar a interrupção imedia</w:t>
+      </w:r>
+      <w:r>
+        <w:rPr>
+          <w:rFonts w:ascii="Arial" w:hAnsi="Arial"/>
+          <w:color w:val="000000"/>
+          <w:sz w:val="19"/>
+        </w:rPr>
+        <w:t>ta do teste a qualquer instante caso sinta qualquer incômodo.</w:t>
       </w:r>
     </w:p>
     <w:p>
       <w:pPr>
-        <w:spacing w:before="120" w:after="40" w:line="276" w:lineRule="auto"/>
+        <w:spacing w:before="120" w:after="40"/>
       </w:pPr>
       <w:r>
         <w:rPr>
@@ -189,12 +707,20 @@
           <w:color w:val="000000"/>
           <w:sz w:val="19"/>
         </w:rPr>
-        <w:t>A sua participação não trará uma cura direta ou benefício médico imediato no momento do teste. Todavia, a sua colaboração é indispensável para viabilizar uma tecnologia nacional de baixo custo que, integrada a modelos de Inteligência Artificial, poderá ser distribuída no SUS para alertar pacientes com diabetes antes do surgimento de feridas graves, reduzindo internações e amputações.</w:t>
+        <w:t>A sua participação não trará uma cura direta ou benefício médico imediato no momento do teste. Todavia, a sua colaboração é indispensável para viabilizar uma tecnologia</w:t>
+      </w:r>
+      <w:r>
+        <w:rPr>
+          <w:rFonts w:ascii="Arial" w:hAnsi="Arial"/>
+          <w:color w:val="000000"/>
+          <w:sz w:val="19"/>
+        </w:rPr>
+        <w:t xml:space="preserve"> nacional de baixo custo que, integrada a modelos de Inteligência Artificial, poderá ser distribuída no SUS para alertar pacientes com diabetes antes do surgimento de feridas graves, reduzindo internações e amputações.</w:t>
       </w:r>
     </w:p>
     <w:p>
       <w:pPr>
-        <w:spacing w:before="120" w:after="40" w:line="276" w:lineRule="auto"/>
+        <w:spacing w:before="120" w:after="40"/>
       </w:pPr>
       <w:r>
         <w:rPr>
@@ -203,7 +729,16 @@
           <w:color w:val="000000"/>
           <w:sz w:val="20"/>
         </w:rPr>
-        <w:t>5. GARANTIA DE SIGILO E PRIVACIDADE (LGPD)</w:t>
+        <w:t>5. GARANTIA DE SIGILO E PRIVACIDADE (</w:t>
+      </w:r>
+      <w:r>
+        <w:rPr>
+          <w:rFonts w:ascii="Arial" w:hAnsi="Arial"/>
+          <w:b/>
+          <w:color w:val="000000"/>
+          <w:sz w:val="20"/>
+        </w:rPr>
+        <w:t>LGPD)</w:t>
       </w:r>
     </w:p>
     <w:p>
@@ -217,12 +752,20 @@
           <w:color w:val="000000"/>
           <w:sz w:val="19"/>
         </w:rPr>
-        <w:t>Os dados coletados serão usados estritamente para finalidades acadêmicas e científicas. A sua privacidade é protegida por lei e pelas normas éticas do Conselho Nacional de Saúde. O seu nome, imagem ou documento pessoal jamais serão divulgados. Os dados serão identificados apenas por códigos (ex.: VOL-01) e ficarão armazenados em meio digital seguro sob a guarda do pesquisador pelo período de 5 (cinco) anos.</w:t>
+        <w:t>Os dados coletados serão usados estritamente para finalidades acadêmicas e científicas. A sua privacidade é protegida por lei e pelas normas éticas do Conselho Nacional de Saúde. O seu nome, imagem ou documento pessoal jamais serão divulgados. Os dad</w:t>
+      </w:r>
+      <w:r>
+        <w:rPr>
+          <w:rFonts w:ascii="Arial" w:hAnsi="Arial"/>
+          <w:color w:val="000000"/>
+          <w:sz w:val="19"/>
+        </w:rPr>
+        <w:t>os serão identificados apenas por códigos (ex.: VOL-01) e ficarão armazenados em meio digital seguro sob a guarda do pesquisador pelo período de 5 (cinco) anos.</w:t>
       </w:r>
     </w:p>
     <w:p>
       <w:pPr>
-        <w:spacing w:before="120" w:after="40" w:line="276" w:lineRule="auto"/>
+        <w:spacing w:before="120" w:after="40"/>
       </w:pPr>
       <w:r>
         <w:rPr>
@@ -245,12 +788,20 @@
           <w:color w:val="000000"/>
           <w:sz w:val="19"/>
         </w:rPr>
-        <w:t>A participação é totalmente voluntária. Você tem o direito de recusar-se a participar ou de desistir a qualquer momento, sem necessidade de qualquer explicação e sem que isso traga qualquer prejuízo ao seu atendimento de saúde presente ou futuro na Policlínica Piquet Carneiro ou na UERJ.</w:t>
+        <w:t>A participação é totalmente voluntária. Você tem o direito</w:t>
+      </w:r>
+      <w:r>
+        <w:rPr>
+          <w:rFonts w:ascii="Arial" w:hAnsi="Arial"/>
+          <w:color w:val="000000"/>
+          <w:sz w:val="19"/>
+        </w:rPr>
+        <w:t xml:space="preserve"> de recusar-se a participar ou de desistir a qualquer momento, sem necessidade de qualquer explicação e sem que isso traga qualquer prejuízo ao seu atendimento de saúde presente ou futuro na Policlínica Piquet Carneiro ou na UERJ.</w:t>
       </w:r>
     </w:p>
     <w:p>
       <w:pPr>
-        <w:spacing w:before="120" w:after="40" w:line="276" w:lineRule="auto"/>
+        <w:spacing w:before="120" w:after="40"/>
       </w:pPr>
       <w:r>
         <w:rPr>
@@ -259,7 +810,16 @@
           <w:color w:val="000000"/>
           <w:sz w:val="20"/>
         </w:rPr>
-        <w:t>7. CUSTOS, RESSARCIMENTO E INDENIZAÇÃO</w:t>
+        <w:t xml:space="preserve">7. CUSTOS, RESSARCIMENTO </w:t>
+      </w:r>
+      <w:r>
+        <w:rPr>
+          <w:rFonts w:ascii="Arial" w:hAnsi="Arial"/>
+          <w:b/>
+          <w:color w:val="000000"/>
+          <w:sz w:val="20"/>
+        </w:rPr>
+        <w:t>E INDENIZAÇÃO</w:t>
       </w:r>
     </w:p>
     <w:p>
@@ -273,12 +833,20 @@
           <w:color w:val="000000"/>
           <w:sz w:val="19"/>
         </w:rPr>
-        <w:t>Você não terá nenhum custo para participar deste estudo, nem receberá pagamento financeiro por sua participação voluntária. Caso haja qualquer gasto comprovado decorrente diretamente da sua ida à pesquisa (como transporte ou alimentação), você terá direito ao ressarcimento imediato e integral. Adicionalmente, fica assegurada a assistência imediata e a indenização em caso de eventuais danos comprovadamente decorrentes da pesquisa, nos termos da Resolução CNS nº 466/2012.</w:t>
+        <w:t>Você não terá nenhum custo para participar deste estudo, nem receberá pagamento financeiro por sua participação voluntária. Caso haja qualquer gasto comprovado decorrente diretamente da sua ida à pesquisa (como transporte ou alimentação), voc</w:t>
+      </w:r>
+      <w:r>
+        <w:rPr>
+          <w:rFonts w:ascii="Arial" w:hAnsi="Arial"/>
+          <w:color w:val="000000"/>
+          <w:sz w:val="19"/>
+        </w:rPr>
+        <w:t>ê terá direito ao ressarcimento imediato e integral. Adicionalmente, fica assegurada a assistência imediata e a indenização em caso de eventuais danos comprovadamente decorrentes da pesquisa, nos termos da Resolução CNS nº 466/2012.</w:t>
       </w:r>
     </w:p>
     <w:p>
       <w:pPr>
-        <w:spacing w:before="120" w:after="40" w:line="276" w:lineRule="auto"/>
+        <w:spacing w:before="120" w:after="40"/>
       </w:pPr>
       <w:r>
         <w:rPr>
@@ -287,13 +855,26 @@
           <w:color w:val="000000"/>
           <w:sz w:val="20"/>
         </w:rPr>
-        <w:t>8. DADOS DE CONTATO DO PESQUISADOR E DO CEP/HUPE</w:t>
+        <w:t xml:space="preserve">8. DADOS DE CONTATO DO </w:t>
+      </w:r>
+      <w:r>
+        <w:rPr>
+          <w:rFonts w:ascii="Arial" w:hAnsi="Arial"/>
+          <w:b/>
+          <w:color w:val="000000"/>
+          <w:sz w:val="20"/>
+        </w:rPr>
+        <w:t>PESQUISADOR E DO CEP/HUPE</w:t>
       </w:r>
     </w:p>
     <w:p>
       <w:pPr>
         <w:spacing w:before="20" w:after="80" w:line="288" w:lineRule="auto"/>
-        <w:jc w:val="both"/>
+        <w:rPr>
+          <w:rFonts w:ascii="Arial" w:hAnsi="Arial"/>
+          <w:color w:val="000000"/>
+          <w:sz w:val="19"/>
+        </w:rPr>
       </w:pPr>
       <w:r>
         <w:rPr>
@@ -301,25 +882,212 @@
           <w:color w:val="000000"/>
           <w:sz w:val="19"/>
         </w:rPr>
-        <w:t>Você receberá uma via deste documento rubricada e assinada. Em caso de dúvidas sobre o estudo, contate o pesquisador responsável:</w:t>
-        <w:br/>
-        <w:t>• Pesquisador Discente: Chrysthian Chrisley Tadeu Santos Silva</w:t>
-        <w:br/>
-        <w:t>• Orientadora: Prof.ª Dra. Rosa Maria Esteves Moreira da Costa</w:t>
-        <w:br/>
-        <w:t>• E-mail: cytchrisley@gmail.com | Programa de Pós-Graduação em Telessaúde e Saúde Digital – UERJ (Prédio CePeM, 3º andar, Vila Isabel, RJ).</w:t>
-        <w:br/>
-        <w:br/>
-        <w:t>Para considerações ou dúvidas sobre os aspectos éticos da pesquisa, contate o Comitê de Ética em Pesquisa do Hospital Universitário Pedro Ernesto (CEP/HUPE):</w:t>
-        <w:br/>
-        <w:t>• Endereço: Av. Vinte e Oito de Setembro, nº 77 – Prédio do CePeM, 2º andar, sala 33 – Vila Isabel, Rio de Janeiro – RJ – CEP: 20551-030.</w:t>
-        <w:br/>
-        <w:t>• Telefone / WhatsApp: (21) 2868-8253 | E-mail: cep@hupe.uerj.br (Segunda a sexta-feira, das 09:00h às 13:00h).</w:t>
+        <w:t xml:space="preserve">Você receberá uma via deste documento rubricada e assinada. Em caso de dúvidas sobre o estudo, </w:t>
+      </w:r>
+      <w:proofErr w:type="spellStart"/>
+      <w:r>
+        <w:rPr>
+          <w:rFonts w:ascii="Arial" w:hAnsi="Arial"/>
+          <w:color w:val="000000"/>
+          <w:sz w:val="19"/>
+        </w:rPr>
+        <w:t>contate</w:t>
+      </w:r>
+      <w:proofErr w:type="spellEnd"/>
+      <w:r>
+        <w:rPr>
+          <w:rFonts w:ascii="Arial" w:hAnsi="Arial"/>
+          <w:color w:val="000000"/>
+          <w:sz w:val="19"/>
+        </w:rPr>
+        <w:t xml:space="preserve"> o </w:t>
+      </w:r>
+      <w:proofErr w:type="spellStart"/>
+      <w:r>
+        <w:rPr>
+          <w:rFonts w:ascii="Arial" w:hAnsi="Arial"/>
+          <w:color w:val="000000"/>
+          <w:sz w:val="19"/>
+        </w:rPr>
+        <w:t>pesquisador</w:t>
+      </w:r>
+      <w:proofErr w:type="spellEnd"/>
+      <w:r>
+        <w:rPr>
+          <w:rFonts w:ascii="Arial" w:hAnsi="Arial"/>
+          <w:color w:val="000000"/>
+          <w:sz w:val="19"/>
+        </w:rPr>
+        <w:t xml:space="preserve"> </w:t>
+      </w:r>
+      <w:proofErr w:type="spellStart"/>
+      <w:r>
+        <w:rPr>
+          <w:rFonts w:ascii="Arial" w:hAnsi="Arial"/>
+          <w:color w:val="000000"/>
+          <w:sz w:val="19"/>
+        </w:rPr>
+        <w:t>responsável</w:t>
+      </w:r>
+      <w:proofErr w:type="spellEnd"/>
+      <w:r>
+        <w:rPr>
+          <w:rFonts w:ascii="Arial" w:hAnsi="Arial"/>
+          <w:color w:val="000000"/>
+          <w:sz w:val="19"/>
+        </w:rPr>
+        <w:t>:</w:t>
       </w:r>
     </w:p>
     <w:p>
       <w:pPr>
-        <w:spacing w:before="160" w:after="80" w:line="276" w:lineRule="auto"/>
+        <w:spacing w:before="20" w:after="80" w:line="288" w:lineRule="auto"/>
+      </w:pPr>
+      <w:r>
+        <w:rPr>
+          <w:rFonts w:ascii="Arial" w:hAnsi="Arial"/>
+          <w:color w:val="000000"/>
+          <w:sz w:val="19"/>
+        </w:rPr>
+        <w:br/>
+        <w:t>• Pesquisador Discente: Chrysthian Chrisley Tadeu Santos Silva</w:t>
+      </w:r>
+      <w:r>
+        <w:rPr>
+          <w:rFonts w:ascii="Arial" w:hAnsi="Arial"/>
+          <w:color w:val="000000"/>
+          <w:sz w:val="19"/>
+        </w:rPr>
+        <w:br/>
+        <w:t>• Orientadora: Prof.ª Dra. Rosa Maria</w:t>
+      </w:r>
+      <w:r>
+        <w:rPr>
+          <w:rFonts w:ascii="Arial" w:hAnsi="Arial"/>
+          <w:color w:val="000000"/>
+          <w:sz w:val="19"/>
+        </w:rPr>
+        <w:t xml:space="preserve"> Esteves Moreira da Costa</w:t>
+      </w:r>
+      <w:r>
+        <w:rPr>
+          <w:rFonts w:ascii="Arial" w:hAnsi="Arial"/>
+          <w:color w:val="000000"/>
+          <w:sz w:val="19"/>
+        </w:rPr>
+        <w:br/>
+        <w:t>• E-mail: cytchrisley@gmail.com | Programa de Pós-Graduação em Telessaúde e Saúde Digital – UERJ (Prédio CePeM, 3º andar, Vila Isabel, RJ).</w:t>
+      </w:r>
+      <w:r>
+        <w:rPr>
+          <w:rFonts w:ascii="Arial" w:hAnsi="Arial"/>
+          <w:color w:val="000000"/>
+          <w:sz w:val="19"/>
+        </w:rPr>
+        <w:br/>
+      </w:r>
+      <w:r>
+        <w:rPr>
+          <w:rFonts w:ascii="Arial" w:hAnsi="Arial"/>
+          <w:color w:val="000000"/>
+          <w:sz w:val="19"/>
+        </w:rPr>
+        <w:br/>
+        <w:t>Para considerações ou dúvidas sobre os aspectos éticos da pesquisa, contate o Comitê de É</w:t>
+      </w:r>
+      <w:r>
+        <w:rPr>
+          <w:rFonts w:ascii="Arial" w:hAnsi="Arial"/>
+          <w:color w:val="000000"/>
+          <w:sz w:val="19"/>
+        </w:rPr>
+        <w:t>tica em Pesquisa do Hospital Universitário Pedro Ernesto (CEP/HUPE):</w:t>
+      </w:r>
+      <w:r>
+        <w:rPr>
+          <w:rFonts w:ascii="Arial" w:hAnsi="Arial"/>
+          <w:color w:val="000000"/>
+          <w:sz w:val="19"/>
+        </w:rPr>
+        <w:br/>
+        <w:t>• Endereço: Av. Vinte e Oito de Setembro, nº 77 – Prédio do CePeM, 2º andar, sala 33 – Vila Isabel, Rio de Janeiro – RJ – CEP: 20551-030.</w:t>
+      </w:r>
+      <w:r>
+        <w:rPr>
+          <w:rFonts w:ascii="Arial" w:hAnsi="Arial"/>
+          <w:color w:val="000000"/>
+          <w:sz w:val="19"/>
+        </w:rPr>
+        <w:br/>
+        <w:t>• Telefone / WhatsApp: (21) 2868-8253 | E-mail: c</w:t>
+      </w:r>
+      <w:r>
+        <w:rPr>
+          <w:rFonts w:ascii="Arial" w:hAnsi="Arial"/>
+          <w:color w:val="000000"/>
+          <w:sz w:val="19"/>
+        </w:rPr>
+        <w:t>ep@hupe.uerj.br (Segunda a sexta-feira, das 09:00h às 13:00h).</w:t>
+      </w:r>
+    </w:p>
+    <w:p>
+      <w:pPr>
+        <w:spacing w:before="160" w:after="80"/>
+        <w:jc w:val="center"/>
+        <w:rPr>
+          <w:rFonts w:ascii="Arial" w:hAnsi="Arial"/>
+          <w:b/>
+          <w:sz w:val="21"/>
+        </w:rPr>
+      </w:pPr>
+    </w:p>
+    <w:p>
+      <w:pPr>
+        <w:spacing w:before="160" w:after="80"/>
+        <w:jc w:val="center"/>
+        <w:rPr>
+          <w:rFonts w:ascii="Arial" w:hAnsi="Arial"/>
+          <w:b/>
+          <w:sz w:val="21"/>
+        </w:rPr>
+      </w:pPr>
+    </w:p>
+    <w:p>
+      <w:pPr>
+        <w:spacing w:before="160" w:after="80"/>
+        <w:jc w:val="center"/>
+        <w:rPr>
+          <w:rFonts w:ascii="Arial" w:hAnsi="Arial"/>
+          <w:b/>
+          <w:sz w:val="21"/>
+        </w:rPr>
+      </w:pPr>
+    </w:p>
+    <w:p>
+      <w:pPr>
+        <w:spacing w:before="160" w:after="80"/>
+        <w:jc w:val="center"/>
+        <w:rPr>
+          <w:rFonts w:ascii="Arial" w:hAnsi="Arial"/>
+          <w:b/>
+          <w:sz w:val="21"/>
+        </w:rPr>
+      </w:pPr>
+    </w:p>
+    <w:p>
+      <w:pPr>
+        <w:spacing w:before="160" w:after="80"/>
+        <w:jc w:val="center"/>
+        <w:rPr>
+          <w:rFonts w:ascii="Arial" w:hAnsi="Arial"/>
+          <w:b/>
+          <w:sz w:val="21"/>
+        </w:rPr>
+      </w:pPr>
+    </w:p>
+    <w:p>
+      <w:pPr>
+        <w:spacing w:before="160" w:after="80"/>
         <w:jc w:val="center"/>
       </w:pPr>
       <w:r>
@@ -328,6 +1096,7 @@
           <w:b/>
           <w:sz w:val="21"/>
         </w:rPr>
+        <w:lastRenderedPageBreak/>
         <w:t>DECLARAÇÃO DE CONSENTIMENTO PÓS-ESCLARECIDO</w:t>
       </w:r>
     </w:p>
@@ -337,23 +1106,74 @@
         <w:jc w:val="both"/>
       </w:pPr>
       <w:r>
-        <w:t>Eu, ______________________________________________________________________, declaro que li e compreendi as informações acima descritas sobre a pesquisa “Arquitetura de baixo custo para monitoramento preventivo do pé diabético: calibração com baropodômetro e prova de conceito na Policlínica Piquet Carneiro”. Fui devidamente informado(a) dos objetivos, métodos, riscos mínimos e potenciais benefícios. Tive a oportunidade de fazer perguntas e obtive respostas claras. Concordo voluntariamente em participar deste estudo, ciente de que posso revogar meu consentimento a qualquer instante sem sofrer qualquer penalidade.</w:t>
+        <w:t xml:space="preserve">Eu, ______________________________________________________________________, declaro que li e compreendi as informações acima descritas sobre a </w:t>
+      </w:r>
+      <w:r>
+        <w:t>pesquisa “Arquitetura de baixo custo para monitoramento preventivo do pé diabético: calibração com baropodômetro e prova de conceito na Policlínica Piquet Carneiro”. Fui devidamente informado(a) dos objetivos, métodos, riscos mínimos e potenciais benefício</w:t>
+      </w:r>
+      <w:r>
+        <w:t>s. Tive a oportunidade de fazer perguntas e obtive respostas claras. Concordo voluntariamente em participar deste estudo, ciente de que posso revogar meu consentimento a qualquer instante sem sofrer qualquer penalidade.</w:t>
       </w:r>
     </w:p>
     <w:tbl>
       <w:tblPr>
-        <w:tblW w:type="auto" w:w="0"/>
+        <w:tblW w:w="0" w:type="auto"/>
         <w:jc w:val="center"/>
-        <w:tblLook w:firstColumn="1" w:firstRow="1" w:lastColumn="0" w:lastRow="0" w:noHBand="0" w:noVBand="1" w:val="04A0"/>
+        <w:tblLook w:val="04A0"/>
       </w:tblPr>
       <w:tblGrid>
-        <w:gridCol w:w="4896"/>
-        <w:gridCol w:w="4896"/>
+        <w:gridCol w:w="4824"/>
+        <w:gridCol w:w="4824"/>
       </w:tblGrid>
       <w:tr>
+        <w:trPr>
+          <w:jc w:val="center"/>
+        </w:trPr>
         <w:tc>
           <w:tcPr>
-            <w:tcW w:type="dxa" w:w="4824"/>
+            <w:tcW w:w="4824" w:type="dxa"/>
+          </w:tcPr>
+          <w:p>
+            <w:pPr>
+              <w:jc w:val="center"/>
+            </w:pPr>
+            <w:r>
+              <w:rPr>
+                <w:sz w:val="18"/>
+              </w:rPr>
+              <w:t>____________________________________</w:t>
+            </w:r>
+            <w:r>
+              <w:rPr>
+                <w:sz w:val="18"/>
+              </w:rPr>
+              <w:t>_</w:t>
+            </w:r>
+            <w:r>
+              <w:rPr>
+                <w:sz w:val="18"/>
+              </w:rPr>
+              <w:br/>
+              <w:t>Assinatura do(a) Participante Voluntário(a)</w:t>
+            </w:r>
+            <w:r>
+              <w:rPr>
+                <w:sz w:val="18"/>
+              </w:rPr>
+              <w:br/>
+            </w:r>
+            <w:r>
+              <w:rPr>
+                <w:sz w:val="18"/>
+              </w:rPr>
+              <w:br/>
+              <w:t>Data: _____ / _____ / 2026</w:t>
+            </w:r>
+          </w:p>
+        </w:tc>
+        <w:tc>
+          <w:tcPr>
+            <w:tcW w:w="4824" w:type="dxa"/>
           </w:tcPr>
           <w:p>
             <w:pPr>
@@ -364,31 +1184,25 @@
                 <w:sz w:val="18"/>
               </w:rPr>
               <w:t>_____________________________________</w:t>
-              <w:br/>
-              <w:t>Assinatura do(a) Participante Voluntário(a)</w:t>
-              <w:br/>
-              <w:br/>
-              <w:t>Data: _____ / _____ / 2026</w:t>
             </w:r>
-          </w:p>
-        </w:tc>
-        <w:tc>
-          <w:tcPr>
-            <w:tcW w:type="dxa" w:w="4824"/>
-          </w:tcPr>
-          <w:p>
-            <w:pPr>
-              <w:jc w:val="center"/>
-            </w:pPr>
             <w:r>
               <w:rPr>
                 <w:sz w:val="18"/>
               </w:rPr>
-              <w:t>_____________________________________</w:t>
               <w:br/>
               <w:t>Chrysthian Chrisley Tadeu Santos Silva</w:t>
+            </w:r>
+            <w:r>
+              <w:rPr>
+                <w:sz w:val="18"/>
+              </w:rPr>
               <w:br/>
               <w:t>Pesquisador Responsável</w:t>
+            </w:r>
+            <w:r>
+              <w:rPr>
+                <w:sz w:val="18"/>
+              </w:rPr>
               <w:br/>
               <w:t>Data: _____ / _____ / 2026</w:t>
             </w:r>
@@ -401,14 +1215,6 @@
         <w:spacing w:before="200" w:after="0" w:line="240" w:lineRule="auto"/>
         <w:jc w:val="center"/>
       </w:pPr>
-      <w:r>
-        <w:rPr>
-          <w:rFonts w:ascii="Arial" w:hAnsi="Arial"/>
-          <w:b/>
-          <w:sz w:val="16"/>
-        </w:rPr>
-        <w:t>AO FINAL DO PREENCHIMENTO, MANTER TODO O ARQUIVO NA FORMATAÇÃO EM COR PRETA!</w:t>
-      </w:r>
     </w:p>
     <w:sectPr>
       <w:pgSz w:w="12240" w:h="15840"/>
@@ -421,7 +1227,7 @@
 </file>
 
 <file path=word/numbering.xml><?xml version="1.0" encoding="utf-8"?>
-<w:numbering xmlns:wpc="http://schemas.microsoft.com/office/word/2010/wordprocessingCanvas" xmlns:mo="http://schemas.microsoft.com/office/mac/office/2008/main" xmlns:mc="http://schemas.openxmlformats.org/markup-compatibility/2006" xmlns:mv="urn:schemas-microsoft-com:mac:vml" xmlns:o="urn:schemas-microsoft-com:office:office" xmlns:r="http://schemas.openxmlformats.org/officeDocument/2006/relationships" xmlns:m="http://schemas.openxmlformats.org/officeDocument/2006/math" xmlns:v="urn:schemas-microsoft-com:vml" xmlns:wp14="http://schemas.microsoft.com/office/word/2010/wordprocessingDrawing" xmlns:wp="http://schemas.openxmlformats.org/drawingml/2006/wordprocessingDrawing" xmlns:w10="urn:schemas-microsoft-com:office:word" xmlns:w="http://schemas.openxmlformats.org/wordprocessingml/2006/main" xmlns:w14="http://schemas.microsoft.com/office/word/2010/wordml" xmlns:wpg="http://schemas.microsoft.com/office/word/2010/wordprocessingGroup" xmlns:wpi="http://schemas.microsoft.com/office/word/2010/wordprocessingInk" xmlns:wne="http://schemas.microsoft.com/office/word/2006/wordml" xmlns:wps="http://schemas.microsoft.com/office/word/2010/wordprocessingShape" mc:Ignorable="w14 wp14">
+<w:numbering xmlns:ve="http://schemas.openxmlformats.org/markup-compatibility/2006" xmlns:o="urn:schemas-microsoft-com:office:office" xmlns:r="http://schemas.openxmlformats.org/officeDocument/2006/relationships" xmlns:m="http://schemas.openxmlformats.org/officeDocument/2006/math" xmlns:v="urn:schemas-microsoft-com:vml" xmlns:wp="http://schemas.openxmlformats.org/drawingml/2006/wordprocessingDrawing" xmlns:w10="urn:schemas-microsoft-com:office:word" xmlns:w="http://schemas.openxmlformats.org/wordprocessingml/2006/main" xmlns:wne="http://schemas.microsoft.com/office/word/2006/wordml">
   <w:abstractNum w:abstractNumId="0">
     <w:nsid w:val="FFFFFF7C"/>
     <w:multiLevelType w:val="singleLevel"/>
@@ -463,7 +1269,7 @@
     <w:lvl w:ilvl="0">
       <w:start w:val="1"/>
       <w:numFmt w:val="decimal"/>
-      <w:pStyle w:val="ListNumber3"/>
+      <w:pStyle w:val="Numerada3"/>
       <w:lvlText w:val="%1."/>
       <w:lvlJc w:val="left"/>
       <w:pPr>
@@ -481,7 +1287,7 @@
     <w:lvl w:ilvl="0">
       <w:start w:val="1"/>
       <w:numFmt w:val="decimal"/>
-      <w:pStyle w:val="ListNumber2"/>
+      <w:pStyle w:val="Numerada2"/>
       <w:lvlText w:val="%1."/>
       <w:lvlJc w:val="left"/>
       <w:pPr>
@@ -519,7 +1325,7 @@
     <w:lvl w:ilvl="0">
       <w:start w:val="1"/>
       <w:numFmt w:val="bullet"/>
-      <w:pStyle w:val="ListBullet3"/>
+      <w:pStyle w:val="Commarcadores3"/>
       <w:lvlText w:val=""/>
       <w:lvlJc w:val="left"/>
       <w:pPr>
@@ -540,7 +1346,7 @@
     <w:lvl w:ilvl="0">
       <w:start w:val="1"/>
       <w:numFmt w:val="bullet"/>
-      <w:pStyle w:val="ListBullet2"/>
+      <w:pStyle w:val="Commarcadores2"/>
       <w:lvlText w:val=""/>
       <w:lvlJc w:val="left"/>
       <w:pPr>
@@ -561,7 +1367,7 @@
     <w:lvl w:ilvl="0">
       <w:start w:val="1"/>
       <w:numFmt w:val="decimal"/>
-      <w:pStyle w:val="ListNumber"/>
+      <w:pStyle w:val="Numerada"/>
       <w:lvlText w:val="%1."/>
       <w:lvlJc w:val="left"/>
       <w:pPr>
@@ -579,7 +1385,7 @@
     <w:lvl w:ilvl="0">
       <w:start w:val="1"/>
       <w:numFmt w:val="bullet"/>
-      <w:pStyle w:val="ListBullet"/>
+      <w:pStyle w:val="Commarcadores"/>
       <w:lvlText w:val=""/>
       <w:lvlJc w:val="left"/>
       <w:pPr>
@@ -624,7 +1430,7 @@
 </file>
 
 <file path=word/styles.xml><?xml version="1.0" encoding="utf-8"?>
-<w:styles xmlns:mc="http://schemas.openxmlformats.org/markup-compatibility/2006" xmlns:r="http://schemas.openxmlformats.org/officeDocument/2006/relationships" xmlns:w="http://schemas.openxmlformats.org/wordprocessingml/2006/main" xmlns:w14="http://schemas.microsoft.com/office/word/2010/wordml" mc:Ignorable="w14">
+<w:styles xmlns:r="http://schemas.openxmlformats.org/officeDocument/2006/relationships" xmlns:w="http://schemas.openxmlformats.org/wordprocessingml/2006/main">
   <w:docDefaults>
     <w:rPrDefault>
       <w:rPr>
@@ -640,7 +1446,7 @@
       </w:pPr>
     </w:pPrDefault>
   </w:docDefaults>
-  <w:latentStyles w:defLockedState="0" w:defUIPriority="99" w:defSemiHidden="1" w:defUnhideWhenUsed="1" w:defQFormat="0" w:count="276">
+  <w:latentStyles w:defLockedState="0" w:defUIPriority="99" w:defSemiHidden="1" w:defUnhideWhenUsed="1" w:defQFormat="0" w:count="267">
     <w:lsdException w:name="Normal" w:semiHidden="0" w:uiPriority="0" w:unhideWhenUsed="0" w:qFormat="1"/>
     <w:lsdException w:name="heading 1" w:semiHidden="0" w:uiPriority="9" w:unhideWhenUsed="0" w:qFormat="1"/>
     <w:lsdException w:name="heading 2" w:uiPriority="9" w:qFormat="1"/>
@@ -784,55 +1590,11 @@
     <w:qFormat/>
     <w:rsid w:val="00FC693F"/>
   </w:style>
-  <w:style w:type="paragraph" w:styleId="Header">
-    <w:name w:val="header"/>
-    <w:basedOn w:val="Normal"/>
-    <w:link w:val="HeaderChar"/>
-    <w:uiPriority w:val="99"/>
-    <w:unhideWhenUsed/>
-    <w:rsid w:val="00E618BF"/>
-    <w:pPr>
-      <w:tabs>
-        <w:tab w:val="center" w:pos="4680"/>
-        <w:tab w:val="right" w:pos="9360"/>
-      </w:tabs>
-      <w:spacing w:after="0" w:line="240" w:lineRule="auto"/>
-    </w:pPr>
-  </w:style>
-  <w:style w:type="character" w:customStyle="1" w:styleId="HeaderChar">
-    <w:name w:val="Header Char"/>
-    <w:basedOn w:val="DefaultParagraphFont"/>
-    <w:link w:val="Header"/>
-    <w:uiPriority w:val="99"/>
-    <w:rsid w:val="00E618BF"/>
-  </w:style>
-  <w:style w:type="paragraph" w:styleId="Footer">
-    <w:name w:val="footer"/>
-    <w:basedOn w:val="Normal"/>
-    <w:link w:val="FooterChar"/>
-    <w:uiPriority w:val="99"/>
-    <w:unhideWhenUsed/>
-    <w:rsid w:val="00E618BF"/>
-    <w:pPr>
-      <w:tabs>
-        <w:tab w:val="center" w:pos="4680"/>
-        <w:tab w:val="right" w:pos="9360"/>
-      </w:tabs>
-      <w:spacing w:after="0" w:line="240" w:lineRule="auto"/>
-    </w:pPr>
-  </w:style>
-  <w:style w:type="character" w:customStyle="1" w:styleId="FooterChar">
-    <w:name w:val="Footer Char"/>
-    <w:basedOn w:val="DefaultParagraphFont"/>
-    <w:link w:val="Footer"/>
-    <w:uiPriority w:val="99"/>
-    <w:rsid w:val="00E618BF"/>
-  </w:style>
-  <w:style w:type="paragraph" w:styleId="Heading1">
+  <w:style w:type="paragraph" w:styleId="Ttulo1">
     <w:name w:val="heading 1"/>
     <w:basedOn w:val="Normal"/>
     <w:next w:val="Normal"/>
-    <w:link w:val="Heading1Char"/>
+    <w:link w:val="Ttulo1Char"/>
     <w:uiPriority w:val="9"/>
     <w:qFormat/>
     <w:rsid w:val="00FC693F"/>
@@ -851,11 +1613,11 @@
       <w:szCs w:val="28"/>
     </w:rPr>
   </w:style>
-  <w:style w:type="paragraph" w:styleId="Heading2">
+  <w:style w:type="paragraph" w:styleId="Ttulo2">
     <w:name w:val="heading 2"/>
     <w:basedOn w:val="Normal"/>
     <w:next w:val="Normal"/>
-    <w:link w:val="Heading2Char"/>
+    <w:link w:val="Ttulo2Char"/>
     <w:uiPriority w:val="9"/>
     <w:unhideWhenUsed/>
     <w:qFormat/>
@@ -875,11 +1637,11 @@
       <w:szCs w:val="26"/>
     </w:rPr>
   </w:style>
-  <w:style w:type="paragraph" w:styleId="Heading3">
+  <w:style w:type="paragraph" w:styleId="Ttulo3">
     <w:name w:val="heading 3"/>
     <w:basedOn w:val="Normal"/>
     <w:next w:val="Normal"/>
-    <w:link w:val="Heading3Char"/>
+    <w:link w:val="Ttulo3Char"/>
     <w:uiPriority w:val="9"/>
     <w:unhideWhenUsed/>
     <w:qFormat/>
@@ -897,11 +1659,11 @@
       <w:color w:val="4F81BD" w:themeColor="accent1"/>
     </w:rPr>
   </w:style>
-  <w:style w:type="paragraph" w:styleId="Heading4">
+  <w:style w:type="paragraph" w:styleId="Ttulo4">
     <w:name w:val="heading 4"/>
     <w:basedOn w:val="Normal"/>
     <w:next w:val="Normal"/>
-    <w:link w:val="Heading4Char"/>
+    <w:link w:val="Ttulo4Char"/>
     <w:uiPriority w:val="9"/>
     <w:semiHidden/>
     <w:unhideWhenUsed/>
@@ -922,11 +1684,11 @@
       <w:color w:val="4F81BD" w:themeColor="accent1"/>
     </w:rPr>
   </w:style>
-  <w:style w:type="paragraph" w:styleId="Heading5">
+  <w:style w:type="paragraph" w:styleId="Ttulo5">
     <w:name w:val="heading 5"/>
     <w:basedOn w:val="Normal"/>
     <w:next w:val="Normal"/>
-    <w:link w:val="Heading5Char"/>
+    <w:link w:val="Ttulo5Char"/>
     <w:uiPriority w:val="9"/>
     <w:semiHidden/>
     <w:unhideWhenUsed/>
@@ -943,11 +1705,11 @@
       <w:color w:val="243F60" w:themeColor="accent1" w:themeShade="7F"/>
     </w:rPr>
   </w:style>
-  <w:style w:type="paragraph" w:styleId="Heading6">
+  <w:style w:type="paragraph" w:styleId="Ttulo6">
     <w:name w:val="heading 6"/>
     <w:basedOn w:val="Normal"/>
     <w:next w:val="Normal"/>
-    <w:link w:val="Heading6Char"/>
+    <w:link w:val="Ttulo6Char"/>
     <w:uiPriority w:val="9"/>
     <w:semiHidden/>
     <w:unhideWhenUsed/>
@@ -966,11 +1728,11 @@
       <w:color w:val="243F60" w:themeColor="accent1" w:themeShade="7F"/>
     </w:rPr>
   </w:style>
-  <w:style w:type="paragraph" w:styleId="Heading7">
+  <w:style w:type="paragraph" w:styleId="Ttulo7">
     <w:name w:val="heading 7"/>
     <w:basedOn w:val="Normal"/>
     <w:next w:val="Normal"/>
-    <w:link w:val="Heading7Char"/>
+    <w:link w:val="Ttulo7Char"/>
     <w:uiPriority w:val="9"/>
     <w:semiHidden/>
     <w:unhideWhenUsed/>
@@ -989,11 +1751,11 @@
       <w:color w:val="404040" w:themeColor="text1" w:themeTint="BF"/>
     </w:rPr>
   </w:style>
-  <w:style w:type="paragraph" w:styleId="Heading8">
+  <w:style w:type="paragraph" w:styleId="Ttulo8">
     <w:name w:val="heading 8"/>
     <w:basedOn w:val="Normal"/>
     <w:next w:val="Normal"/>
-    <w:link w:val="Heading8Char"/>
+    <w:link w:val="Ttulo8Char"/>
     <w:uiPriority w:val="9"/>
     <w:semiHidden/>
     <w:unhideWhenUsed/>
@@ -1012,11 +1774,11 @@
       <w:szCs w:val="20"/>
     </w:rPr>
   </w:style>
-  <w:style w:type="paragraph" w:styleId="Heading9">
+  <w:style w:type="paragraph" w:styleId="Ttulo9">
     <w:name w:val="heading 9"/>
     <w:basedOn w:val="Normal"/>
     <w:next w:val="Normal"/>
-    <w:link w:val="Heading9Char"/>
+    <w:link w:val="Ttulo9Char"/>
     <w:uiPriority w:val="9"/>
     <w:semiHidden/>
     <w:unhideWhenUsed/>
@@ -1037,17 +1799,18 @@
       <w:szCs w:val="20"/>
     </w:rPr>
   </w:style>
-  <w:style w:type="character" w:default="1" w:styleId="DefaultParagraphFont">
+  <w:style w:type="character" w:default="1" w:styleId="Fontepargpadro">
     <w:name w:val="Default Paragraph Font"/>
     <w:uiPriority w:val="1"/>
     <w:semiHidden/>
     <w:unhideWhenUsed/>
   </w:style>
-  <w:style w:type="table" w:default="1" w:styleId="TableNormal">
+  <w:style w:type="table" w:default="1" w:styleId="Tabelanormal">
     <w:name w:val="Normal Table"/>
     <w:uiPriority w:val="99"/>
     <w:semiHidden/>
     <w:unhideWhenUsed/>
+    <w:qFormat/>
     <w:tblPr>
       <w:tblInd w:w="0" w:type="dxa"/>
       <w:tblCellMar>
@@ -1058,13 +1821,57 @@
       </w:tblCellMar>
     </w:tblPr>
   </w:style>
-  <w:style w:type="numbering" w:default="1" w:styleId="NoList">
+  <w:style w:type="numbering" w:default="1" w:styleId="Semlista">
     <w:name w:val="No List"/>
     <w:uiPriority w:val="99"/>
     <w:semiHidden/>
     <w:unhideWhenUsed/>
   </w:style>
-  <w:style w:type="paragraph" w:styleId="NoSpacing">
+  <w:style w:type="paragraph" w:styleId="Cabealho">
+    <w:name w:val="header"/>
+    <w:basedOn w:val="Normal"/>
+    <w:link w:val="CabealhoChar"/>
+    <w:uiPriority w:val="99"/>
+    <w:unhideWhenUsed/>
+    <w:rsid w:val="00E618BF"/>
+    <w:pPr>
+      <w:tabs>
+        <w:tab w:val="center" w:pos="4680"/>
+        <w:tab w:val="right" w:pos="9360"/>
+      </w:tabs>
+      <w:spacing w:after="0" w:line="240" w:lineRule="auto"/>
+    </w:pPr>
+  </w:style>
+  <w:style w:type="character" w:customStyle="1" w:styleId="CabealhoChar">
+    <w:name w:val="Cabeçalho Char"/>
+    <w:basedOn w:val="Fontepargpadro"/>
+    <w:link w:val="Cabealho"/>
+    <w:uiPriority w:val="99"/>
+    <w:rsid w:val="00E618BF"/>
+  </w:style>
+  <w:style w:type="paragraph" w:styleId="Rodap">
+    <w:name w:val="footer"/>
+    <w:basedOn w:val="Normal"/>
+    <w:link w:val="RodapChar"/>
+    <w:uiPriority w:val="99"/>
+    <w:unhideWhenUsed/>
+    <w:rsid w:val="00E618BF"/>
+    <w:pPr>
+      <w:tabs>
+        <w:tab w:val="center" w:pos="4680"/>
+        <w:tab w:val="right" w:pos="9360"/>
+      </w:tabs>
+      <w:spacing w:after="0" w:line="240" w:lineRule="auto"/>
+    </w:pPr>
+  </w:style>
+  <w:style w:type="character" w:customStyle="1" w:styleId="RodapChar">
+    <w:name w:val="Rodapé Char"/>
+    <w:basedOn w:val="Fontepargpadro"/>
+    <w:link w:val="Rodap"/>
+    <w:uiPriority w:val="99"/>
+    <w:rsid w:val="00E618BF"/>
+  </w:style>
+  <w:style w:type="paragraph" w:styleId="SemEspaamento">
     <w:name w:val="No Spacing"/>
     <w:uiPriority w:val="1"/>
     <w:qFormat/>
@@ -1073,10 +1880,10 @@
       <w:spacing w:after="0" w:line="240" w:lineRule="auto"/>
     </w:pPr>
   </w:style>
-  <w:style w:type="character" w:customStyle="1" w:styleId="Heading1Char">
-    <w:name w:val="Heading 1 Char"/>
-    <w:basedOn w:val="DefaultParagraphFont"/>
-    <w:link w:val="Heading1"/>
+  <w:style w:type="character" w:customStyle="1" w:styleId="Ttulo1Char">
+    <w:name w:val="Título 1 Char"/>
+    <w:basedOn w:val="Fontepargpadro"/>
+    <w:link w:val="Ttulo1"/>
     <w:uiPriority w:val="9"/>
     <w:rsid w:val="00FC693F"/>
     <w:rPr>
@@ -1088,10 +1895,10 @@
       <w:szCs w:val="28"/>
     </w:rPr>
   </w:style>
-  <w:style w:type="character" w:customStyle="1" w:styleId="Heading2Char">
-    <w:name w:val="Heading 2 Char"/>
-    <w:basedOn w:val="DefaultParagraphFont"/>
-    <w:link w:val="Heading2"/>
+  <w:style w:type="character" w:customStyle="1" w:styleId="Ttulo2Char">
+    <w:name w:val="Título 2 Char"/>
+    <w:basedOn w:val="Fontepargpadro"/>
+    <w:link w:val="Ttulo2"/>
     <w:uiPriority w:val="9"/>
     <w:rsid w:val="00FC693F"/>
     <w:rPr>
@@ -1103,10 +1910,10 @@
       <w:szCs w:val="26"/>
     </w:rPr>
   </w:style>
-  <w:style w:type="character" w:customStyle="1" w:styleId="Heading3Char">
-    <w:name w:val="Heading 3 Char"/>
-    <w:basedOn w:val="DefaultParagraphFont"/>
-    <w:link w:val="Heading3"/>
+  <w:style w:type="character" w:customStyle="1" w:styleId="Ttulo3Char">
+    <w:name w:val="Título 3 Char"/>
+    <w:basedOn w:val="Fontepargpadro"/>
+    <w:link w:val="Ttulo3"/>
     <w:uiPriority w:val="9"/>
     <w:rsid w:val="00FC693F"/>
     <w:rPr>
@@ -1116,11 +1923,11 @@
       <w:color w:val="4F81BD" w:themeColor="accent1"/>
     </w:rPr>
   </w:style>
-  <w:style w:type="paragraph" w:styleId="Title">
+  <w:style w:type="paragraph" w:styleId="Ttulo">
     <w:name w:val="Title"/>
     <w:basedOn w:val="Normal"/>
     <w:next w:val="Normal"/>
-    <w:link w:val="TitleChar"/>
+    <w:link w:val="TtuloChar"/>
     <w:uiPriority w:val="10"/>
     <w:qFormat/>
     <w:rsid w:val="00FC693F"/>
@@ -1140,10 +1947,10 @@
       <w:szCs w:val="52"/>
     </w:rPr>
   </w:style>
-  <w:style w:type="character" w:customStyle="1" w:styleId="TitleChar">
-    <w:name w:val="Title Char"/>
-    <w:basedOn w:val="DefaultParagraphFont"/>
-    <w:link w:val="Title"/>
+  <w:style w:type="character" w:customStyle="1" w:styleId="TtuloChar">
+    <w:name w:val="Título Char"/>
+    <w:basedOn w:val="Fontepargpadro"/>
+    <w:link w:val="Ttulo"/>
     <w:uiPriority w:val="10"/>
     <w:rsid w:val="00FC693F"/>
     <w:rPr>
@@ -1155,11 +1962,11 @@
       <w:szCs w:val="52"/>
     </w:rPr>
   </w:style>
-  <w:style w:type="paragraph" w:styleId="Subtitle">
+  <w:style w:type="paragraph" w:styleId="Subttulo">
     <w:name w:val="Subtitle"/>
     <w:basedOn w:val="Normal"/>
     <w:next w:val="Normal"/>
-    <w:link w:val="SubtitleChar"/>
+    <w:link w:val="SubttuloChar"/>
     <w:uiPriority w:val="11"/>
     <w:qFormat/>
     <w:rsid w:val="00FC693F"/>
@@ -1178,10 +1985,10 @@
       <w:szCs w:val="24"/>
     </w:rPr>
   </w:style>
-  <w:style w:type="character" w:customStyle="1" w:styleId="SubtitleChar">
-    <w:name w:val="Subtitle Char"/>
-    <w:basedOn w:val="DefaultParagraphFont"/>
-    <w:link w:val="Subtitle"/>
+  <w:style w:type="character" w:customStyle="1" w:styleId="SubttuloChar">
+    <w:name w:val="Subtítulo Char"/>
+    <w:basedOn w:val="Fontepargpadro"/>
+    <w:link w:val="Subttulo"/>
     <w:uiPriority w:val="11"/>
     <w:rsid w:val="00FC693F"/>
     <w:rPr>
@@ -1194,7 +2001,7 @@
       <w:szCs w:val="24"/>
     </w:rPr>
   </w:style>
-  <w:style w:type="paragraph" w:styleId="ListParagraph">
+  <w:style w:type="paragraph" w:styleId="PargrafodaLista">
     <w:name w:val="List Paragraph"/>
     <w:basedOn w:val="Normal"/>
     <w:uiPriority w:val="34"/>
@@ -1205,10 +2012,10 @@
       <w:contextualSpacing/>
     </w:pPr>
   </w:style>
-  <w:style w:type="paragraph" w:styleId="BodyText">
+  <w:style w:type="paragraph" w:styleId="Corpodetexto">
     <w:name w:val="Body Text"/>
     <w:basedOn w:val="Normal"/>
-    <w:link w:val="BodyTextChar"/>
+    <w:link w:val="CorpodetextoChar"/>
     <w:uiPriority w:val="99"/>
     <w:unhideWhenUsed/>
     <w:rsid w:val="00AA1D8D"/>
@@ -1216,17 +2023,17 @@
       <w:spacing w:after="120"/>
     </w:pPr>
   </w:style>
-  <w:style w:type="character" w:customStyle="1" w:styleId="BodyTextChar">
-    <w:name w:val="Body Text Char"/>
-    <w:basedOn w:val="DefaultParagraphFont"/>
-    <w:link w:val="BodyText"/>
+  <w:style w:type="character" w:customStyle="1" w:styleId="CorpodetextoChar">
+    <w:name w:val="Corpo de texto Char"/>
+    <w:basedOn w:val="Fontepargpadro"/>
+    <w:link w:val="Corpodetexto"/>
     <w:uiPriority w:val="99"/>
     <w:rsid w:val="00AA1D8D"/>
   </w:style>
-  <w:style w:type="paragraph" w:styleId="BodyText2">
+  <w:style w:type="paragraph" w:styleId="Corpodetexto2">
     <w:name w:val="Body Text 2"/>
     <w:basedOn w:val="Normal"/>
-    <w:link w:val="BodyText2Char"/>
+    <w:link w:val="Corpodetexto2Char"/>
     <w:uiPriority w:val="99"/>
     <w:unhideWhenUsed/>
     <w:rsid w:val="00AA1D8D"/>
@@ -1234,17 +2041,17 @@
       <w:spacing w:after="120" w:line="480" w:lineRule="auto"/>
     </w:pPr>
   </w:style>
-  <w:style w:type="character" w:customStyle="1" w:styleId="BodyText2Char">
-    <w:name w:val="Body Text 2 Char"/>
-    <w:basedOn w:val="DefaultParagraphFont"/>
-    <w:link w:val="BodyText2"/>
+  <w:style w:type="character" w:customStyle="1" w:styleId="Corpodetexto2Char">
+    <w:name w:val="Corpo de texto 2 Char"/>
+    <w:basedOn w:val="Fontepargpadro"/>
+    <w:link w:val="Corpodetexto2"/>
     <w:uiPriority w:val="99"/>
     <w:rsid w:val="00AA1D8D"/>
   </w:style>
-  <w:style w:type="paragraph" w:styleId="BodyText3">
+  <w:style w:type="paragraph" w:styleId="Corpodetexto3">
     <w:name w:val="Body Text 3"/>
     <w:basedOn w:val="Normal"/>
-    <w:link w:val="BodyText3Char"/>
+    <w:link w:val="Corpodetexto3Char"/>
     <w:uiPriority w:val="99"/>
     <w:unhideWhenUsed/>
     <w:rsid w:val="00AA1D8D"/>
@@ -1256,10 +2063,10 @@
       <w:szCs w:val="16"/>
     </w:rPr>
   </w:style>
-  <w:style w:type="character" w:customStyle="1" w:styleId="BodyText3Char">
-    <w:name w:val="Body Text 3 Char"/>
-    <w:basedOn w:val="DefaultParagraphFont"/>
-    <w:link w:val="BodyText3"/>
+  <w:style w:type="character" w:customStyle="1" w:styleId="Corpodetexto3Char">
+    <w:name w:val="Corpo de texto 3 Char"/>
+    <w:basedOn w:val="Fontepargpadro"/>
+    <w:link w:val="Corpodetexto3"/>
     <w:uiPriority w:val="99"/>
     <w:rsid w:val="00AA1D8D"/>
     <w:rPr>
@@ -1267,7 +2074,7 @@
       <w:szCs w:val="16"/>
     </w:rPr>
   </w:style>
-  <w:style w:type="paragraph" w:styleId="List">
+  <w:style w:type="paragraph" w:styleId="Lista">
     <w:name w:val="List"/>
     <w:basedOn w:val="Normal"/>
     <w:uiPriority w:val="99"/>
@@ -1278,7 +2085,7 @@
       <w:contextualSpacing/>
     </w:pPr>
   </w:style>
-  <w:style w:type="paragraph" w:styleId="List2">
+  <w:style w:type="paragraph" w:styleId="Lista2">
     <w:name w:val="List 2"/>
     <w:basedOn w:val="Normal"/>
     <w:uiPriority w:val="99"/>
@@ -1289,7 +2096,7 @@
       <w:contextualSpacing/>
     </w:pPr>
   </w:style>
-  <w:style w:type="paragraph" w:styleId="List3">
+  <w:style w:type="paragraph" w:styleId="Lista3">
     <w:name w:val="List 3"/>
     <w:basedOn w:val="Normal"/>
     <w:uiPriority w:val="99"/>
@@ -1300,7 +2107,7 @@
       <w:contextualSpacing/>
     </w:pPr>
   </w:style>
-  <w:style w:type="paragraph" w:styleId="ListBullet">
+  <w:style w:type="paragraph" w:styleId="Commarcadores">
     <w:name w:val="List Bullet"/>
     <w:basedOn w:val="Normal"/>
     <w:uiPriority w:val="99"/>
@@ -1313,7 +2120,7 @@
       <w:contextualSpacing/>
     </w:pPr>
   </w:style>
-  <w:style w:type="paragraph" w:styleId="ListBullet2">
+  <w:style w:type="paragraph" w:styleId="Commarcadores2">
     <w:name w:val="List Bullet 2"/>
     <w:basedOn w:val="Normal"/>
     <w:uiPriority w:val="99"/>
@@ -1326,7 +2133,7 @@
       <w:contextualSpacing/>
     </w:pPr>
   </w:style>
-  <w:style w:type="paragraph" w:styleId="ListBullet3">
+  <w:style w:type="paragraph" w:styleId="Commarcadores3">
     <w:name w:val="List Bullet 3"/>
     <w:basedOn w:val="Normal"/>
     <w:uiPriority w:val="99"/>
@@ -1339,7 +2146,7 @@
       <w:contextualSpacing/>
     </w:pPr>
   </w:style>
-  <w:style w:type="paragraph" w:styleId="ListNumber">
+  <w:style w:type="paragraph" w:styleId="Numerada">
     <w:name w:val="List Number"/>
     <w:basedOn w:val="Normal"/>
     <w:uiPriority w:val="99"/>
@@ -1352,7 +2159,7 @@
       <w:contextualSpacing/>
     </w:pPr>
   </w:style>
-  <w:style w:type="paragraph" w:styleId="ListNumber2">
+  <w:style w:type="paragraph" w:styleId="Numerada2">
     <w:name w:val="List Number 2"/>
     <w:basedOn w:val="Normal"/>
     <w:uiPriority w:val="99"/>
@@ -1365,7 +2172,7 @@
       <w:contextualSpacing/>
     </w:pPr>
   </w:style>
-  <w:style w:type="paragraph" w:styleId="ListNumber3">
+  <w:style w:type="paragraph" w:styleId="Numerada3">
     <w:name w:val="List Number 3"/>
     <w:basedOn w:val="Normal"/>
     <w:uiPriority w:val="99"/>
@@ -1378,7 +2185,7 @@
       <w:contextualSpacing/>
     </w:pPr>
   </w:style>
-  <w:style w:type="paragraph" w:styleId="ListContinue">
+  <w:style w:type="paragraph" w:styleId="Listadecontinuao">
     <w:name w:val="List Continue"/>
     <w:basedOn w:val="Normal"/>
     <w:uiPriority w:val="99"/>
@@ -1390,7 +2197,7 @@
       <w:contextualSpacing/>
     </w:pPr>
   </w:style>
-  <w:style w:type="paragraph" w:styleId="ListContinue2">
+  <w:style w:type="paragraph" w:styleId="Listadecontinuao2">
     <w:name w:val="List Continue 2"/>
     <w:basedOn w:val="Normal"/>
     <w:uiPriority w:val="99"/>
@@ -1402,7 +2209,7 @@
       <w:contextualSpacing/>
     </w:pPr>
   </w:style>
-  <w:style w:type="paragraph" w:styleId="ListContinue3">
+  <w:style w:type="paragraph" w:styleId="Listadecontinuao3">
     <w:name w:val="List Continue 3"/>
     <w:basedOn w:val="Normal"/>
     <w:uiPriority w:val="99"/>
@@ -1414,9 +2221,9 @@
       <w:contextualSpacing/>
     </w:pPr>
   </w:style>
-  <w:style w:type="paragraph" w:styleId="MacroText">
+  <w:style w:type="paragraph" w:styleId="Textodemacro">
     <w:name w:val="macro"/>
-    <w:link w:val="MacroTextChar"/>
+    <w:link w:val="TextodemacroChar"/>
     <w:uiPriority w:val="99"/>
     <w:unhideWhenUsed/>
     <w:rsid w:val="0029639D"/>
@@ -1437,10 +2244,10 @@
       <w:szCs w:val="20"/>
     </w:rPr>
   </w:style>
-  <w:style w:type="character" w:customStyle="1" w:styleId="MacroTextChar">
-    <w:name w:val="Macro Text Char"/>
-    <w:basedOn w:val="DefaultParagraphFont"/>
-    <w:link w:val="MacroText"/>
+  <w:style w:type="character" w:customStyle="1" w:styleId="TextodemacroChar">
+    <w:name w:val="Texto de macro Char"/>
+    <w:basedOn w:val="Fontepargpadro"/>
+    <w:link w:val="Textodemacro"/>
     <w:uiPriority w:val="99"/>
     <w:rsid w:val="0029639D"/>
     <w:rPr>
@@ -1449,11 +2256,11 @@
       <w:szCs w:val="20"/>
     </w:rPr>
   </w:style>
-  <w:style w:type="paragraph" w:styleId="Quote">
+  <w:style w:type="paragraph" w:styleId="Citao">
     <w:name w:val="Quote"/>
     <w:basedOn w:val="Normal"/>
     <w:next w:val="Normal"/>
-    <w:link w:val="QuoteChar"/>
+    <w:link w:val="CitaoChar"/>
     <w:uiPriority w:val="29"/>
     <w:qFormat/>
     <w:rsid w:val="00FC693F"/>
@@ -1463,10 +2270,10 @@
       <w:color w:val="000000" w:themeColor="text1"/>
     </w:rPr>
   </w:style>
-  <w:style w:type="character" w:customStyle="1" w:styleId="QuoteChar">
-    <w:name w:val="Quote Char"/>
-    <w:basedOn w:val="DefaultParagraphFont"/>
-    <w:link w:val="Quote"/>
+  <w:style w:type="character" w:customStyle="1" w:styleId="CitaoChar">
+    <w:name w:val="Citação Char"/>
+    <w:basedOn w:val="Fontepargpadro"/>
+    <w:link w:val="Citao"/>
     <w:uiPriority w:val="29"/>
     <w:rsid w:val="00FC693F"/>
     <w:rPr>
@@ -1475,10 +2282,10 @@
       <w:color w:val="000000" w:themeColor="text1"/>
     </w:rPr>
   </w:style>
-  <w:style w:type="character" w:customStyle="1" w:styleId="Heading4Char">
-    <w:name w:val="Heading 4 Char"/>
-    <w:basedOn w:val="DefaultParagraphFont"/>
-    <w:link w:val="Heading4"/>
+  <w:style w:type="character" w:customStyle="1" w:styleId="Ttulo4Char">
+    <w:name w:val="Título 4 Char"/>
+    <w:basedOn w:val="Fontepargpadro"/>
+    <w:link w:val="Ttulo4"/>
     <w:uiPriority w:val="9"/>
     <w:semiHidden/>
     <w:rsid w:val="00FC693F"/>
@@ -1491,10 +2298,10 @@
       <w:color w:val="4F81BD" w:themeColor="accent1"/>
     </w:rPr>
   </w:style>
-  <w:style w:type="character" w:customStyle="1" w:styleId="Heading5Char">
-    <w:name w:val="Heading 5 Char"/>
-    <w:basedOn w:val="DefaultParagraphFont"/>
-    <w:link w:val="Heading5"/>
+  <w:style w:type="character" w:customStyle="1" w:styleId="Ttulo5Char">
+    <w:name w:val="Título 5 Char"/>
+    <w:basedOn w:val="Fontepargpadro"/>
+    <w:link w:val="Ttulo5"/>
     <w:uiPriority w:val="9"/>
     <w:semiHidden/>
     <w:rsid w:val="00FC693F"/>
@@ -1503,10 +2310,10 @@
       <w:color w:val="243F60" w:themeColor="accent1" w:themeShade="7F"/>
     </w:rPr>
   </w:style>
-  <w:style w:type="character" w:customStyle="1" w:styleId="Heading6Char">
-    <w:name w:val="Heading 6 Char"/>
-    <w:basedOn w:val="DefaultParagraphFont"/>
-    <w:link w:val="Heading6"/>
+  <w:style w:type="character" w:customStyle="1" w:styleId="Ttulo6Char">
+    <w:name w:val="Título 6 Char"/>
+    <w:basedOn w:val="Fontepargpadro"/>
+    <w:link w:val="Ttulo6"/>
     <w:uiPriority w:val="9"/>
     <w:semiHidden/>
     <w:rsid w:val="00FC693F"/>
@@ -1517,10 +2324,10 @@
       <w:color w:val="243F60" w:themeColor="accent1" w:themeShade="7F"/>
     </w:rPr>
   </w:style>
-  <w:style w:type="character" w:customStyle="1" w:styleId="Heading7Char">
-    <w:name w:val="Heading 7 Char"/>
-    <w:basedOn w:val="DefaultParagraphFont"/>
-    <w:link w:val="Heading7"/>
+  <w:style w:type="character" w:customStyle="1" w:styleId="Ttulo7Char">
+    <w:name w:val="Título 7 Char"/>
+    <w:basedOn w:val="Fontepargpadro"/>
+    <w:link w:val="Ttulo7"/>
     <w:uiPriority w:val="9"/>
     <w:semiHidden/>
     <w:rsid w:val="00FC693F"/>
@@ -1531,10 +2338,10 @@
       <w:color w:val="404040" w:themeColor="text1" w:themeTint="BF"/>
     </w:rPr>
   </w:style>
-  <w:style w:type="character" w:customStyle="1" w:styleId="Heading8Char">
-    <w:name w:val="Heading 8 Char"/>
-    <w:basedOn w:val="DefaultParagraphFont"/>
-    <w:link w:val="Heading8"/>
+  <w:style w:type="character" w:customStyle="1" w:styleId="Ttulo8Char">
+    <w:name w:val="Título 8 Char"/>
+    <w:basedOn w:val="Fontepargpadro"/>
+    <w:link w:val="Ttulo8"/>
     <w:uiPriority w:val="9"/>
     <w:semiHidden/>
     <w:rsid w:val="00FC693F"/>
@@ -1545,10 +2352,10 @@
       <w:szCs w:val="20"/>
     </w:rPr>
   </w:style>
-  <w:style w:type="character" w:customStyle="1" w:styleId="Heading9Char">
-    <w:name w:val="Heading 9 Char"/>
-    <w:basedOn w:val="DefaultParagraphFont"/>
-    <w:link w:val="Heading9"/>
+  <w:style w:type="character" w:customStyle="1" w:styleId="Ttulo9Char">
+    <w:name w:val="Título 9 Char"/>
+    <w:basedOn w:val="Fontepargpadro"/>
+    <w:link w:val="Ttulo9"/>
     <w:uiPriority w:val="9"/>
     <w:semiHidden/>
     <w:rsid w:val="00FC693F"/>
@@ -1561,7 +2368,7 @@
       <w:szCs w:val="20"/>
     </w:rPr>
   </w:style>
-  <w:style w:type="paragraph" w:styleId="Caption">
+  <w:style w:type="paragraph" w:styleId="Legenda">
     <w:name w:val="caption"/>
     <w:basedOn w:val="Normal"/>
     <w:next w:val="Normal"/>
@@ -1581,9 +2388,9 @@
       <w:szCs w:val="18"/>
     </w:rPr>
   </w:style>
-  <w:style w:type="character" w:styleId="Strong">
+  <w:style w:type="character" w:styleId="Forte">
     <w:name w:val="Strong"/>
-    <w:basedOn w:val="DefaultParagraphFont"/>
+    <w:basedOn w:val="Fontepargpadro"/>
     <w:uiPriority w:val="22"/>
     <w:qFormat/>
     <w:rsid w:val="00FC693F"/>
@@ -1592,9 +2399,9 @@
       <w:bCs/>
     </w:rPr>
   </w:style>
-  <w:style w:type="character" w:styleId="Emphasis">
+  <w:style w:type="character" w:styleId="nfase">
     <w:name w:val="Emphasis"/>
-    <w:basedOn w:val="DefaultParagraphFont"/>
+    <w:basedOn w:val="Fontepargpadro"/>
     <w:uiPriority w:val="20"/>
     <w:qFormat/>
     <w:rsid w:val="00FC693F"/>
@@ -1603,11 +2410,11 @@
       <w:iCs/>
     </w:rPr>
   </w:style>
-  <w:style w:type="paragraph" w:styleId="IntenseQuote">
+  <w:style w:type="paragraph" w:styleId="CitaoIntensa">
     <w:name w:val="Intense Quote"/>
     <w:basedOn w:val="Normal"/>
     <w:next w:val="Normal"/>
-    <w:link w:val="IntenseQuoteChar"/>
+    <w:link w:val="CitaoIntensaChar"/>
     <w:uiPriority w:val="30"/>
     <w:qFormat/>
     <w:rsid w:val="00FC693F"/>
@@ -1626,10 +2433,10 @@
       <w:color w:val="4F81BD" w:themeColor="accent1"/>
     </w:rPr>
   </w:style>
-  <w:style w:type="character" w:customStyle="1" w:styleId="IntenseQuoteChar">
-    <w:name w:val="Intense Quote Char"/>
-    <w:basedOn w:val="DefaultParagraphFont"/>
-    <w:link w:val="IntenseQuote"/>
+  <w:style w:type="character" w:customStyle="1" w:styleId="CitaoIntensaChar">
+    <w:name w:val="Citação Intensa Char"/>
+    <w:basedOn w:val="Fontepargpadro"/>
+    <w:link w:val="CitaoIntensa"/>
     <w:uiPriority w:val="30"/>
     <w:rsid w:val="00FC693F"/>
     <w:rPr>
@@ -1640,9 +2447,9 @@
       <w:color w:val="4F81BD" w:themeColor="accent1"/>
     </w:rPr>
   </w:style>
-  <w:style w:type="character" w:styleId="SubtleEmphasis">
+  <w:style w:type="character" w:styleId="nfaseSutil">
     <w:name w:val="Subtle Emphasis"/>
-    <w:basedOn w:val="DefaultParagraphFont"/>
+    <w:basedOn w:val="Fontepargpadro"/>
     <w:uiPriority w:val="19"/>
     <w:qFormat/>
     <w:rsid w:val="00FC693F"/>
@@ -1652,9 +2459,9 @@
       <w:color w:val="808080" w:themeColor="text1" w:themeTint="7F"/>
     </w:rPr>
   </w:style>
-  <w:style w:type="character" w:styleId="IntenseEmphasis">
+  <w:style w:type="character" w:styleId="nfaseIntensa">
     <w:name w:val="Intense Emphasis"/>
-    <w:basedOn w:val="DefaultParagraphFont"/>
+    <w:basedOn w:val="Fontepargpadro"/>
     <w:uiPriority w:val="21"/>
     <w:qFormat/>
     <w:rsid w:val="00FC693F"/>
@@ -1666,9 +2473,9 @@
       <w:color w:val="4F81BD" w:themeColor="accent1"/>
     </w:rPr>
   </w:style>
-  <w:style w:type="character" w:styleId="SubtleReference">
+  <w:style w:type="character" w:styleId="RefernciaSutil">
     <w:name w:val="Subtle Reference"/>
-    <w:basedOn w:val="DefaultParagraphFont"/>
+    <w:basedOn w:val="Fontepargpadro"/>
     <w:uiPriority w:val="31"/>
     <w:qFormat/>
     <w:rsid w:val="00FC693F"/>
@@ -1678,9 +2485,9 @@
       <w:u w:val="single"/>
     </w:rPr>
   </w:style>
-  <w:style w:type="character" w:styleId="IntenseReference">
+  <w:style w:type="character" w:styleId="RefernciaIntensa">
     <w:name w:val="Intense Reference"/>
-    <w:basedOn w:val="DefaultParagraphFont"/>
+    <w:basedOn w:val="Fontepargpadro"/>
     <w:uiPriority w:val="32"/>
     <w:qFormat/>
     <w:rsid w:val="00FC693F"/>
@@ -1693,9 +2500,9 @@
       <w:u w:val="single"/>
     </w:rPr>
   </w:style>
-  <w:style w:type="character" w:styleId="BookTitle">
+  <w:style w:type="character" w:styleId="TtulodoLivro">
     <w:name w:val="Book Title"/>
-    <w:basedOn w:val="DefaultParagraphFont"/>
+    <w:basedOn w:val="Fontepargpadro"/>
     <w:uiPriority w:val="33"/>
     <w:qFormat/>
     <w:rsid w:val="00FC693F"/>
@@ -1706,9 +2513,9 @@
       <w:spacing w:val="5"/>
     </w:rPr>
   </w:style>
-  <w:style w:type="paragraph" w:styleId="TOCHeading">
+  <w:style w:type="paragraph" w:styleId="CabealhodoSumrio">
     <w:name w:val="TOC Heading"/>
-    <w:basedOn w:val="Heading1"/>
+    <w:basedOn w:val="Ttulo1"/>
     <w:next w:val="Normal"/>
     <w:uiPriority w:val="39"/>
     <w:semiHidden/>
@@ -1719,9 +2526,9 @@
       <w:outlineLvl w:val="9"/>
     </w:pPr>
   </w:style>
-  <w:style w:type="table" w:styleId="TableGrid">
+  <w:style w:type="table" w:styleId="Tabelacomgrade">
     <w:name w:val="Table Grid"/>
-    <w:basedOn w:val="TableNormal"/>
+    <w:basedOn w:val="Tabelanormal"/>
     <w:uiPriority w:val="59"/>
     <w:rsid w:val="00FC693F"/>
     <w:pPr>
@@ -1745,9 +2552,9 @@
       </w:tblCellMar>
     </w:tblPr>
   </w:style>
-  <w:style w:type="table" w:styleId="LightShading">
+  <w:style w:type="table" w:styleId="SombreamentoClaro">
     <w:name w:val="Light Shading"/>
-    <w:basedOn w:val="TableNormal"/>
+    <w:basedOn w:val="Tabelanormal"/>
     <w:uiPriority w:val="60"/>
     <w:rsid w:val="00FC693F"/>
     <w:pPr>
@@ -1848,9 +2655,9 @@
       </w:tcPr>
     </w:tblStylePr>
   </w:style>
-  <w:style w:type="table" w:styleId="LightShading-Accent1">
+  <w:style w:type="table" w:styleId="SombreamentoClaro-nfase1">
     <w:name w:val="Light Shading Accent 1"/>
-    <w:basedOn w:val="TableNormal"/>
+    <w:basedOn w:val="Tabelanormal"/>
     <w:uiPriority w:val="60"/>
     <w:rsid w:val="00FC693F"/>
     <w:pPr>
@@ -1951,9 +2758,9 @@
       </w:tcPr>
     </w:tblStylePr>
   </w:style>
-  <w:style w:type="table" w:styleId="LightShading-Accent2">
+  <w:style w:type="table" w:styleId="SombreamentoClaro-nfase2">
     <w:name w:val="Light Shading Accent 2"/>
-    <w:basedOn w:val="TableNormal"/>
+    <w:basedOn w:val="Tabelanormal"/>
     <w:uiPriority w:val="60"/>
     <w:rsid w:val="00FC693F"/>
     <w:pPr>
@@ -2054,9 +2861,9 @@
       </w:tcPr>
     </w:tblStylePr>
   </w:style>
-  <w:style w:type="table" w:styleId="LightShading-Accent3">
+  <w:style w:type="table" w:styleId="SombreamentoClaro-nfase3">
     <w:name w:val="Light Shading Accent 3"/>
-    <w:basedOn w:val="TableNormal"/>
+    <w:basedOn w:val="Tabelanormal"/>
     <w:uiPriority w:val="60"/>
     <w:rsid w:val="00FC693F"/>
     <w:pPr>
@@ -2157,9 +2964,9 @@
       </w:tcPr>
     </w:tblStylePr>
   </w:style>
-  <w:style w:type="table" w:styleId="LightShading-Accent4">
+  <w:style w:type="table" w:styleId="SombreamentoClaro-nfase4">
     <w:name w:val="Light Shading Accent 4"/>
-    <w:basedOn w:val="TableNormal"/>
+    <w:basedOn w:val="Tabelanormal"/>
     <w:uiPriority w:val="60"/>
     <w:rsid w:val="00FC693F"/>
     <w:pPr>
@@ -2260,9 +3067,9 @@
       </w:tcPr>
     </w:tblStylePr>
   </w:style>
-  <w:style w:type="table" w:styleId="LightShading-Accent5">
+  <w:style w:type="table" w:styleId="SombreamentoClaro-nfase5">
     <w:name w:val="Light Shading Accent 5"/>
-    <w:basedOn w:val="TableNormal"/>
+    <w:basedOn w:val="Tabelanormal"/>
     <w:uiPriority w:val="60"/>
     <w:rsid w:val="00FC693F"/>
     <w:pPr>
@@ -2363,9 +3170,9 @@
       </w:tcPr>
     </w:tblStylePr>
   </w:style>
-  <w:style w:type="table" w:styleId="LightShading-Accent6">
+  <w:style w:type="table" w:styleId="SombreamentoClaro-nfase6">
     <w:name w:val="Light Shading Accent 6"/>
-    <w:basedOn w:val="TableNormal"/>
+    <w:basedOn w:val="Tabelanormal"/>
     <w:uiPriority w:val="60"/>
     <w:rsid w:val="00FC693F"/>
     <w:pPr>
@@ -2466,9 +3273,9 @@
       </w:tcPr>
     </w:tblStylePr>
   </w:style>
-  <w:style w:type="table" w:styleId="LightList">
+  <w:style w:type="table" w:styleId="ListaClara">
     <w:name w:val="Light List"/>
-    <w:basedOn w:val="TableNormal"/>
+    <w:basedOn w:val="Tabelanormal"/>
     <w:uiPriority w:val="61"/>
     <w:rsid w:val="00FC693F"/>
     <w:pPr>
@@ -2558,9 +3365,9 @@
       </w:tcPr>
     </w:tblStylePr>
   </w:style>
-  <w:style w:type="table" w:styleId="LightList-Accent1">
+  <w:style w:type="table" w:styleId="ListaClara-nfase1">
     <w:name w:val="Light List Accent 1"/>
-    <w:basedOn w:val="TableNormal"/>
+    <w:basedOn w:val="Tabelanormal"/>
     <w:uiPriority w:val="61"/>
     <w:rsid w:val="00FC693F"/>
     <w:pPr>
@@ -2650,9 +3457,9 @@
       </w:tcPr>
     </w:tblStylePr>
   </w:style>
-  <w:style w:type="table" w:styleId="LightList-Accent2">
+  <w:style w:type="table" w:styleId="ListaClara-nfase2">
     <w:name w:val="Light List Accent 2"/>
-    <w:basedOn w:val="TableNormal"/>
+    <w:basedOn w:val="Tabelanormal"/>
     <w:uiPriority w:val="61"/>
     <w:rsid w:val="00CB0664"/>
     <w:pPr>
@@ -2742,9 +3549,9 @@
       </w:tcPr>
     </w:tblStylePr>
   </w:style>
-  <w:style w:type="table" w:styleId="LightList-Accent3">
+  <w:style w:type="table" w:styleId="ListaClara-nfase3">
     <w:name w:val="Light List Accent 3"/>
-    <w:basedOn w:val="TableNormal"/>
+    <w:basedOn w:val="Tabelanormal"/>
     <w:uiPriority w:val="61"/>
     <w:rsid w:val="00CB0664"/>
     <w:pPr>
@@ -2834,9 +3641,9 @@
       </w:tcPr>
     </w:tblStylePr>
   </w:style>
-  <w:style w:type="table" w:styleId="LightList-Accent4">
+  <w:style w:type="table" w:styleId="ListaClara-nfase4">
     <w:name w:val="Light List Accent 4"/>
-    <w:basedOn w:val="TableNormal"/>
+    <w:basedOn w:val="Tabelanormal"/>
     <w:uiPriority w:val="61"/>
     <w:rsid w:val="00CB0664"/>
     <w:pPr>
@@ -2926,9 +3733,9 @@
       </w:tcPr>
     </w:tblStylePr>
   </w:style>
-  <w:style w:type="table" w:styleId="LightList-Accent5">
+  <w:style w:type="table" w:styleId="ListaClara-nfase5">
     <w:name w:val="Light List Accent 5"/>
-    <w:basedOn w:val="TableNormal"/>
+    <w:basedOn w:val="Tabelanormal"/>
     <w:uiPriority w:val="61"/>
     <w:rsid w:val="00CB0664"/>
     <w:pPr>
@@ -3018,9 +3825,9 @@
       </w:tcPr>
     </w:tblStylePr>
   </w:style>
-  <w:style w:type="table" w:styleId="LightList-Accent6">
+  <w:style w:type="table" w:styleId="ListaClara-nfase6">
     <w:name w:val="Light List Accent 6"/>
-    <w:basedOn w:val="TableNormal"/>
+    <w:basedOn w:val="Tabelanormal"/>
     <w:uiPriority w:val="61"/>
     <w:rsid w:val="00CB0664"/>
     <w:pPr>
@@ -3110,9 +3917,9 @@
       </w:tcPr>
     </w:tblStylePr>
   </w:style>
-  <w:style w:type="table" w:styleId="LightGrid">
+  <w:style w:type="table" w:styleId="GradeClara">
     <w:name w:val="Light Grid"/>
-    <w:basedOn w:val="TableNormal"/>
+    <w:basedOn w:val="Tabelanormal"/>
     <w:uiPriority w:val="62"/>
     <w:rsid w:val="00CB0664"/>
     <w:pPr>
@@ -3240,9 +4047,9 @@
       </w:tcPr>
     </w:tblStylePr>
   </w:style>
-  <w:style w:type="table" w:styleId="LightGrid-Accent1">
+  <w:style w:type="table" w:styleId="GradeClara-nfase1">
     <w:name w:val="Light Grid Accent 1"/>
-    <w:basedOn w:val="TableNormal"/>
+    <w:basedOn w:val="Tabelanormal"/>
     <w:uiPriority w:val="62"/>
     <w:rsid w:val="00CB0664"/>
     <w:pPr>
@@ -3370,9 +4177,9 @@
       </w:tcPr>
     </w:tblStylePr>
   </w:style>
-  <w:style w:type="table" w:styleId="LightGrid-Accent2">
+  <w:style w:type="table" w:styleId="GradeClara-nfase2">
     <w:name w:val="Light Grid Accent 2"/>
-    <w:basedOn w:val="TableNormal"/>
+    <w:basedOn w:val="Tabelanormal"/>
     <w:uiPriority w:val="62"/>
     <w:rsid w:val="00CB0664"/>
     <w:pPr>
@@ -3500,9 +4307,9 @@
       </w:tcPr>
     </w:tblStylePr>
   </w:style>
-  <w:style w:type="table" w:styleId="LightGrid-Accent3">
+  <w:style w:type="table" w:styleId="GradeClara-nfase3">
     <w:name w:val="Light Grid Accent 3"/>
-    <w:basedOn w:val="TableNormal"/>
+    <w:basedOn w:val="Tabelanormal"/>
     <w:uiPriority w:val="62"/>
     <w:rsid w:val="00CB0664"/>
     <w:pPr>
@@ -3630,9 +4437,9 @@
       </w:tcPr>
     </w:tblStylePr>
   </w:style>
-  <w:style w:type="table" w:styleId="LightGrid-Accent4">
+  <w:style w:type="table" w:styleId="GradeClara-nfase4">
     <w:name w:val="Light Grid Accent 4"/>
-    <w:basedOn w:val="TableNormal"/>
+    <w:basedOn w:val="Tabelanormal"/>
     <w:uiPriority w:val="62"/>
     <w:rsid w:val="00CB0664"/>
     <w:pPr>
@@ -3760,9 +4567,9 @@
       </w:tcPr>
     </w:tblStylePr>
   </w:style>
-  <w:style w:type="table" w:styleId="LightGrid-Accent5">
+  <w:style w:type="table" w:styleId="GradeClara-nfase5">
     <w:name w:val="Light Grid Accent 5"/>
-    <w:basedOn w:val="TableNormal"/>
+    <w:basedOn w:val="Tabelanormal"/>
     <w:uiPriority w:val="62"/>
     <w:rsid w:val="00CB0664"/>
     <w:pPr>
@@ -3890,9 +4697,9 @@
       </w:tcPr>
     </w:tblStylePr>
   </w:style>
-  <w:style w:type="table" w:styleId="LightGrid-Accent6">
+  <w:style w:type="table" w:styleId="GradeClara-nfase6">
     <w:name w:val="Light Grid Accent 6"/>
-    <w:basedOn w:val="TableNormal"/>
+    <w:basedOn w:val="Tabelanormal"/>
     <w:uiPriority w:val="62"/>
     <w:rsid w:val="00CB0664"/>
     <w:pPr>
@@ -4020,9 +4827,9 @@
       </w:tcPr>
     </w:tblStylePr>
   </w:style>
-  <w:style w:type="table" w:styleId="MediumShading1">
+  <w:style w:type="table" w:styleId="SombreamentoMdio1">
     <w:name w:val="Medium Shading 1"/>
-    <w:basedOn w:val="TableNormal"/>
+    <w:basedOn w:val="Tabelanormal"/>
     <w:uiPriority w:val="63"/>
     <w:rsid w:val="00CB0664"/>
     <w:pPr>
@@ -4126,9 +4933,9 @@
       </w:tcPr>
     </w:tblStylePr>
   </w:style>
-  <w:style w:type="table" w:styleId="MediumShading1-Accent1">
+  <w:style w:type="table" w:styleId="SombreamentoMdio1-nfase1">
     <w:name w:val="Medium Shading 1 Accent 1"/>
-    <w:basedOn w:val="TableNormal"/>
+    <w:basedOn w:val="Tabelanormal"/>
     <w:uiPriority w:val="63"/>
     <w:rsid w:val="00CB0664"/>
     <w:pPr>
@@ -4232,9 +5039,9 @@
       </w:tcPr>
     </w:tblStylePr>
   </w:style>
-  <w:style w:type="table" w:styleId="MediumShading1-Accent2">
+  <w:style w:type="table" w:styleId="SombreamentoMdio1-nfase2">
     <w:name w:val="Medium Shading 1 Accent 2"/>
-    <w:basedOn w:val="TableNormal"/>
+    <w:basedOn w:val="Tabelanormal"/>
     <w:uiPriority w:val="63"/>
     <w:rsid w:val="00CB0664"/>
     <w:pPr>
@@ -4338,9 +5145,9 @@
       </w:tcPr>
     </w:tblStylePr>
   </w:style>
-  <w:style w:type="table" w:styleId="MediumShading1-Accent3">
+  <w:style w:type="table" w:styleId="SombreamentoMdio1-nfase3">
     <w:name w:val="Medium Shading 1 Accent 3"/>
-    <w:basedOn w:val="TableNormal"/>
+    <w:basedOn w:val="Tabelanormal"/>
     <w:uiPriority w:val="63"/>
     <w:rsid w:val="00CB0664"/>
     <w:pPr>
@@ -4444,9 +5251,9 @@
       </w:tcPr>
     </w:tblStylePr>
   </w:style>
-  <w:style w:type="table" w:styleId="MediumShading1-Accent4">
+  <w:style w:type="table" w:styleId="SombreamentoMdio1-nfase4">
     <w:name w:val="Medium Shading 1 Accent 4"/>
-    <w:basedOn w:val="TableNormal"/>
+    <w:basedOn w:val="Tabelanormal"/>
     <w:uiPriority w:val="63"/>
     <w:rsid w:val="00CB0664"/>
     <w:pPr>
@@ -4550,9 +5357,9 @@
       </w:tcPr>
     </w:tblStylePr>
   </w:style>
-  <w:style w:type="table" w:styleId="MediumShading1-Accent5">
+  <w:style w:type="table" w:styleId="SombreamentoMdio1-nfase5">
     <w:name w:val="Medium Shading 1 Accent 5"/>
-    <w:basedOn w:val="TableNormal"/>
+    <w:basedOn w:val="Tabelanormal"/>
     <w:uiPriority w:val="63"/>
     <w:rsid w:val="00CB0664"/>
     <w:pPr>
@@ -4656,9 +5463,9 @@
       </w:tcPr>
     </w:tblStylePr>
   </w:style>
-  <w:style w:type="table" w:styleId="MediumShading1-Accent6">
+  <w:style w:type="table" w:styleId="SombreamentoMdio1-nfase6">
     <w:name w:val="Medium Shading 1 Accent 6"/>
-    <w:basedOn w:val="TableNormal"/>
+    <w:basedOn w:val="Tabelanormal"/>
     <w:uiPriority w:val="63"/>
     <w:rsid w:val="00CB0664"/>
     <w:pPr>
@@ -4762,9 +5569,9 @@
       </w:tcPr>
     </w:tblStylePr>
   </w:style>
-  <w:style w:type="table" w:styleId="MediumShading2">
+  <w:style w:type="table" w:styleId="SombreamentoMdio2">
     <w:name w:val="Medium Shading 2"/>
-    <w:basedOn w:val="TableNormal"/>
+    <w:basedOn w:val="Tabelanormal"/>
     <w:uiPriority w:val="64"/>
     <w:rsid w:val="00CB0664"/>
     <w:pPr>
@@ -4911,9 +5718,9 @@
       </w:tcPr>
     </w:tblStylePr>
   </w:style>
-  <w:style w:type="table" w:styleId="MediumShading2-Accent1">
+  <w:style w:type="table" w:styleId="SombreamentoMdio2-nfase1">
     <w:name w:val="Medium Shading 2 Accent 1"/>
-    <w:basedOn w:val="TableNormal"/>
+    <w:basedOn w:val="Tabelanormal"/>
     <w:uiPriority w:val="64"/>
     <w:rsid w:val="00CB0664"/>
     <w:pPr>
@@ -5060,9 +5867,9 @@
       </w:tcPr>
     </w:tblStylePr>
   </w:style>
-  <w:style w:type="table" w:styleId="MediumShading2-Accent2">
+  <w:style w:type="table" w:styleId="SombreamentoMdio2-nfase2">
     <w:name w:val="Medium Shading 2 Accent 2"/>
-    <w:basedOn w:val="TableNormal"/>
+    <w:basedOn w:val="Tabelanormal"/>
     <w:uiPriority w:val="64"/>
     <w:rsid w:val="00CB0664"/>
     <w:pPr>
@@ -5209,9 +6016,9 @@
       </w:tcPr>
     </w:tblStylePr>
   </w:style>
-  <w:style w:type="table" w:styleId="MediumShading2-Accent3">
+  <w:style w:type="table" w:styleId="SombreamentoMdio2-nfase3">
     <w:name w:val="Medium Shading 2 Accent 3"/>
-    <w:basedOn w:val="TableNormal"/>
+    <w:basedOn w:val="Tabelanormal"/>
     <w:uiPriority w:val="64"/>
     <w:rsid w:val="00CB0664"/>
     <w:pPr>
@@ -5358,9 +6165,9 @@
       </w:tcPr>
     </w:tblStylePr>
   </w:style>
-  <w:style w:type="table" w:styleId="MediumShading2-Accent4">
+  <w:style w:type="table" w:styleId="SombreamentoMdio2-nfase4">
     <w:name w:val="Medium Shading 2 Accent 4"/>
-    <w:basedOn w:val="TableNormal"/>
+    <w:basedOn w:val="Tabelanormal"/>
     <w:uiPriority w:val="64"/>
     <w:rsid w:val="00CB0664"/>
     <w:pPr>
@@ -5507,9 +6314,9 @@
       </w:tcPr>
     </w:tblStylePr>
   </w:style>
-  <w:style w:type="table" w:styleId="MediumShading2-Accent5">
+  <w:style w:type="table" w:styleId="SombreamentoMdio2-nfase5">
     <w:name w:val="Medium Shading 2 Accent 5"/>
-    <w:basedOn w:val="TableNormal"/>
+    <w:basedOn w:val="Tabelanormal"/>
     <w:uiPriority w:val="64"/>
     <w:rsid w:val="00CB0664"/>
     <w:pPr>
@@ -5656,9 +6463,9 @@
       </w:tcPr>
     </w:tblStylePr>
   </w:style>
-  <w:style w:type="table" w:styleId="MediumShading2-Accent6">
+  <w:style w:type="table" w:styleId="SombreamentoMdio2-nfase6">
     <w:name w:val="Medium Shading 2 Accent 6"/>
-    <w:basedOn w:val="TableNormal"/>
+    <w:basedOn w:val="Tabelanormal"/>
     <w:uiPriority w:val="64"/>
     <w:rsid w:val="00CB0664"/>
     <w:pPr>
@@ -5805,9 +6612,9 @@
       </w:tcPr>
     </w:tblStylePr>
   </w:style>
-  <w:style w:type="table" w:styleId="MediumList1">
+  <w:style w:type="table" w:styleId="ListaMdia1">
     <w:name w:val="Medium List 1"/>
-    <w:basedOn w:val="TableNormal"/>
+    <w:basedOn w:val="Tabelanormal"/>
     <w:uiPriority w:val="65"/>
     <w:rsid w:val="00CB0664"/>
     <w:pPr>
@@ -5889,9 +6696,9 @@
       </w:tcPr>
     </w:tblStylePr>
   </w:style>
-  <w:style w:type="table" w:styleId="MediumList1-Accent1">
+  <w:style w:type="table" w:styleId="ListaMdia1-nfase1">
     <w:name w:val="Medium List 1 Accent 1"/>
-    <w:basedOn w:val="TableNormal"/>
+    <w:basedOn w:val="Tabelanormal"/>
     <w:uiPriority w:val="65"/>
     <w:rsid w:val="00CB0664"/>
     <w:pPr>
@@ -5973,9 +6780,9 @@
       </w:tcPr>
     </w:tblStylePr>
   </w:style>
-  <w:style w:type="table" w:styleId="MediumList1-Accent2">
+  <w:style w:type="table" w:styleId="ListaMdia1-nfase2">
     <w:name w:val="Medium List 1 Accent 2"/>
-    <w:basedOn w:val="TableNormal"/>
+    <w:basedOn w:val="Tabelanormal"/>
     <w:uiPriority w:val="65"/>
     <w:rsid w:val="00CB0664"/>
     <w:pPr>
@@ -6057,9 +6864,9 @@
       </w:tcPr>
     </w:tblStylePr>
   </w:style>
-  <w:style w:type="table" w:styleId="MediumList1-Accent3">
+  <w:style w:type="table" w:styleId="ListaMdia1-nfase3">
     <w:name w:val="Medium List 1 Accent 3"/>
-    <w:basedOn w:val="TableNormal"/>
+    <w:basedOn w:val="Tabelanormal"/>
     <w:uiPriority w:val="65"/>
     <w:rsid w:val="00CB0664"/>
     <w:pPr>
@@ -6141,9 +6948,9 @@
       </w:tcPr>
     </w:tblStylePr>
   </w:style>
-  <w:style w:type="table" w:styleId="MediumList1-Accent4">
+  <w:style w:type="table" w:styleId="ListaMdia1-nfase4">
     <w:name w:val="Medium List 1 Accent 4"/>
-    <w:basedOn w:val="TableNormal"/>
+    <w:basedOn w:val="Tabelanormal"/>
     <w:uiPriority w:val="65"/>
     <w:rsid w:val="00CB0664"/>
     <w:pPr>
@@ -6225,9 +7032,9 @@
       </w:tcPr>
     </w:tblStylePr>
   </w:style>
-  <w:style w:type="table" w:styleId="MediumList1-Accent5">
+  <w:style w:type="table" w:styleId="ListaMdia1-nfase5">
     <w:name w:val="Medium List 1 Accent 5"/>
-    <w:basedOn w:val="TableNormal"/>
+    <w:basedOn w:val="Tabelanormal"/>
     <w:uiPriority w:val="65"/>
     <w:rsid w:val="00CB0664"/>
     <w:pPr>
@@ -6309,9 +7116,9 @@
       </w:tcPr>
     </w:tblStylePr>
   </w:style>
-  <w:style w:type="table" w:styleId="MediumList1-Accent6">
+  <w:style w:type="table" w:styleId="ListaMdia1-nfase6">
     <w:name w:val="Medium List 1 Accent 6"/>
-    <w:basedOn w:val="TableNormal"/>
+    <w:basedOn w:val="Tabelanormal"/>
     <w:uiPriority w:val="65"/>
     <w:rsid w:val="00CB0664"/>
     <w:pPr>
@@ -6393,9 +7200,9 @@
       </w:tcPr>
     </w:tblStylePr>
   </w:style>
-  <w:style w:type="table" w:styleId="MediumList2">
+  <w:style w:type="table" w:styleId="ListaMdia2">
     <w:name w:val="Medium List 2"/>
-    <w:basedOn w:val="TableNormal"/>
+    <w:basedOn w:val="Tabelanormal"/>
     <w:uiPriority w:val="66"/>
     <w:rsid w:val="00CB0664"/>
     <w:pPr>
@@ -6521,9 +7328,9 @@
       </w:tcPr>
     </w:tblStylePr>
   </w:style>
-  <w:style w:type="table" w:styleId="MediumList2-Accent1">
+  <w:style w:type="table" w:styleId="ListaMdia2-nfase1">
     <w:name w:val="Medium List 2 Accent 1"/>
-    <w:basedOn w:val="TableNormal"/>
+    <w:basedOn w:val="Tabelanormal"/>
     <w:uiPriority w:val="66"/>
     <w:rsid w:val="00CB0664"/>
     <w:pPr>
@@ -6649,9 +7456,9 @@
       </w:tcPr>
     </w:tblStylePr>
   </w:style>
-  <w:style w:type="table" w:styleId="MediumList2-Accent2">
+  <w:style w:type="table" w:styleId="ListaMdia2-nfase2">
     <w:name w:val="Medium List 2 Accent 2"/>
-    <w:basedOn w:val="TableNormal"/>
+    <w:basedOn w:val="Tabelanormal"/>
     <w:uiPriority w:val="66"/>
     <w:rsid w:val="00CB0664"/>
     <w:pPr>
@@ -6777,9 +7584,9 @@
       </w:tcPr>
     </w:tblStylePr>
   </w:style>
-  <w:style w:type="table" w:styleId="MediumList2-Accent3">
+  <w:style w:type="table" w:styleId="ListaMdia2-nfase3">
     <w:name w:val="Medium List 2 Accent 3"/>
-    <w:basedOn w:val="TableNormal"/>
+    <w:basedOn w:val="Tabelanormal"/>
     <w:uiPriority w:val="66"/>
     <w:rsid w:val="00CB0664"/>
     <w:pPr>
@@ -6905,9 +7712,9 @@
       </w:tcPr>
     </w:tblStylePr>
   </w:style>
-  <w:style w:type="table" w:styleId="MediumList2-Accent4">
+  <w:style w:type="table" w:styleId="ListaMdia2-nfase4">
     <w:name w:val="Medium List 2 Accent 4"/>
-    <w:basedOn w:val="TableNormal"/>
+    <w:basedOn w:val="Tabelanormal"/>
     <w:uiPriority w:val="66"/>
     <w:rsid w:val="00CB0664"/>
     <w:pPr>
@@ -7033,9 +7840,9 @@
       </w:tcPr>
     </w:tblStylePr>
   </w:style>
-  <w:style w:type="table" w:styleId="MediumList2-Accent5">
+  <w:style w:type="table" w:styleId="ListaMdia2-nfase5">
     <w:name w:val="Medium List 2 Accent 5"/>
-    <w:basedOn w:val="TableNormal"/>
+    <w:basedOn w:val="Tabelanormal"/>
     <w:uiPriority w:val="66"/>
     <w:rsid w:val="00CB0664"/>
     <w:pPr>
@@ -7161,9 +7968,9 @@
       </w:tcPr>
     </w:tblStylePr>
   </w:style>
-  <w:style w:type="table" w:styleId="MediumList2-Accent6">
+  <w:style w:type="table" w:styleId="ListaMdia2-nfase6">
     <w:name w:val="Medium List 2 Accent 6"/>
-    <w:basedOn w:val="TableNormal"/>
+    <w:basedOn w:val="Tabelanormal"/>
     <w:uiPriority w:val="66"/>
     <w:rsid w:val="00CB0664"/>
     <w:pPr>
@@ -7289,9 +8096,9 @@
       </w:tcPr>
     </w:tblStylePr>
   </w:style>
-  <w:style w:type="table" w:styleId="MediumGrid1">
+  <w:style w:type="table" w:styleId="GradeMdia1">
     <w:name w:val="Medium Grid 1"/>
-    <w:basedOn w:val="TableNormal"/>
+    <w:basedOn w:val="Tabelanormal"/>
     <w:uiPriority w:val="67"/>
     <w:rsid w:val="00CB0664"/>
     <w:pPr>
@@ -7362,9 +8169,9 @@
       </w:tcPr>
     </w:tblStylePr>
   </w:style>
-  <w:style w:type="table" w:styleId="MediumGrid1-Accent1">
+  <w:style w:type="table" w:styleId="GradeMdia1-nfase1">
     <w:name w:val="Medium Grid 1 Accent 1"/>
-    <w:basedOn w:val="TableNormal"/>
+    <w:basedOn w:val="Tabelanormal"/>
     <w:uiPriority w:val="67"/>
     <w:rsid w:val="00CB0664"/>
     <w:pPr>
@@ -7435,9 +8242,9 @@
       </w:tcPr>
     </w:tblStylePr>
   </w:style>
-  <w:style w:type="table" w:styleId="MediumGrid1-Accent2">
+  <w:style w:type="table" w:styleId="GradeMdia1-nfase2">
     <w:name w:val="Medium Grid 1 Accent 2"/>
-    <w:basedOn w:val="TableNormal"/>
+    <w:basedOn w:val="Tabelanormal"/>
     <w:uiPriority w:val="67"/>
     <w:rsid w:val="00CB0664"/>
     <w:pPr>
@@ -7508,9 +8315,9 @@
       </w:tcPr>
     </w:tblStylePr>
   </w:style>
-  <w:style w:type="table" w:styleId="MediumGrid1-Accent3">
+  <w:style w:type="table" w:styleId="GradeMdia1-nfase3">
     <w:name w:val="Medium Grid 1 Accent 3"/>
-    <w:basedOn w:val="TableNormal"/>
+    <w:basedOn w:val="Tabelanormal"/>
     <w:uiPriority w:val="67"/>
     <w:rsid w:val="00CB0664"/>
     <w:pPr>
@@ -7581,9 +8388,9 @@
       </w:tcPr>
     </w:tblStylePr>
   </w:style>
-  <w:style w:type="table" w:styleId="MediumGrid1-Accent4">
+  <w:style w:type="table" w:styleId="GradeMdia1-nfase4">
     <w:name w:val="Medium Grid 1 Accent 4"/>
-    <w:basedOn w:val="TableNormal"/>
+    <w:basedOn w:val="Tabelanormal"/>
     <w:uiPriority w:val="67"/>
     <w:rsid w:val="00CB0664"/>
     <w:pPr>
@@ -7654,9 +8461,9 @@
       </w:tcPr>
     </w:tblStylePr>
   </w:style>
-  <w:style w:type="table" w:styleId="MediumGrid1-Accent5">
+  <w:style w:type="table" w:styleId="GradeMdia1-nfase5">
     <w:name w:val="Medium Grid 1 Accent 5"/>
-    <w:basedOn w:val="TableNormal"/>
+    <w:basedOn w:val="Tabelanormal"/>
     <w:uiPriority w:val="67"/>
     <w:rsid w:val="00CB0664"/>
     <w:pPr>
@@ -7727,9 +8534,9 @@
       </w:tcPr>
     </w:tblStylePr>
   </w:style>
-  <w:style w:type="table" w:styleId="MediumGrid1-Accent6">
+  <w:style w:type="table" w:styleId="GradeMdia1-nfase6">
     <w:name w:val="Medium Grid 1 Accent 6"/>
-    <w:basedOn w:val="TableNormal"/>
+    <w:basedOn w:val="Tabelanormal"/>
     <w:uiPriority w:val="67"/>
     <w:rsid w:val="00CB0664"/>
     <w:pPr>
@@ -7800,9 +8607,9 @@
       </w:tcPr>
     </w:tblStylePr>
   </w:style>
-  <w:style w:type="table" w:styleId="MediumGrid2">
+  <w:style w:type="table" w:styleId="GradeMdia2">
     <w:name w:val="Medium Grid 2"/>
-    <w:basedOn w:val="TableNormal"/>
+    <w:basedOn w:val="Tabelanormal"/>
     <w:uiPriority w:val="68"/>
     <w:rsid w:val="00CB0664"/>
     <w:pPr>
@@ -7925,9 +8732,9 @@
       </w:tcPr>
     </w:tblStylePr>
   </w:style>
-  <w:style w:type="table" w:styleId="MediumGrid2-Accent1">
+  <w:style w:type="table" w:styleId="GradeMdia2-nfase1">
     <w:name w:val="Medium Grid 2 Accent 1"/>
-    <w:basedOn w:val="TableNormal"/>
+    <w:basedOn w:val="Tabelanormal"/>
     <w:uiPriority w:val="68"/>
     <w:rsid w:val="00CB0664"/>
     <w:pPr>
@@ -8050,9 +8857,9 @@
       </w:tcPr>
     </w:tblStylePr>
   </w:style>
-  <w:style w:type="table" w:styleId="MediumGrid2-Accent2">
+  <w:style w:type="table" w:styleId="GradeMdia2-nfase2">
     <w:name w:val="Medium Grid 2 Accent 2"/>
-    <w:basedOn w:val="TableNormal"/>
+    <w:basedOn w:val="Tabelanormal"/>
     <w:uiPriority w:val="68"/>
     <w:rsid w:val="00CB0664"/>
     <w:pPr>
@@ -8175,9 +8982,9 @@
       </w:tcPr>
     </w:tblStylePr>
   </w:style>
-  <w:style w:type="table" w:styleId="MediumGrid2-Accent3">
+  <w:style w:type="table" w:styleId="GradeMdia2-nfase3">
     <w:name w:val="Medium Grid 2 Accent 3"/>
-    <w:basedOn w:val="TableNormal"/>
+    <w:basedOn w:val="Tabelanormal"/>
     <w:uiPriority w:val="68"/>
     <w:rsid w:val="00CB0664"/>
     <w:pPr>
@@ -8300,9 +9107,9 @@
       </w:tcPr>
     </w:tblStylePr>
   </w:style>
-  <w:style w:type="table" w:styleId="MediumGrid2-Accent4">
+  <w:style w:type="table" w:styleId="GradeMdia2-nfase4">
     <w:name w:val="Medium Grid 2 Accent 4"/>
-    <w:basedOn w:val="TableNormal"/>
+    <w:basedOn w:val="Tabelanormal"/>
     <w:uiPriority w:val="68"/>
     <w:rsid w:val="00CB0664"/>
     <w:pPr>
@@ -8425,9 +9232,9 @@
       </w:tcPr>
     </w:tblStylePr>
   </w:style>
-  <w:style w:type="table" w:styleId="MediumGrid2-Accent5">
+  <w:style w:type="table" w:styleId="GradeMdia2-nfase5">
     <w:name w:val="Medium Grid 2 Accent 5"/>
-    <w:basedOn w:val="TableNormal"/>
+    <w:basedOn w:val="Tabelanormal"/>
     <w:uiPriority w:val="68"/>
     <w:rsid w:val="00CB0664"/>
     <w:pPr>
@@ -8550,9 +9357,9 @@
       </w:tcPr>
     </w:tblStylePr>
   </w:style>
-  <w:style w:type="table" w:styleId="MediumGrid2-Accent6">
+  <w:style w:type="table" w:styleId="GradeMdia2-nfase6">
     <w:name w:val="Medium Grid 2 Accent 6"/>
-    <w:basedOn w:val="TableNormal"/>
+    <w:basedOn w:val="Tabelanormal"/>
     <w:uiPriority w:val="68"/>
     <w:rsid w:val="00CB0664"/>
     <w:pPr>
@@ -8675,9 +9482,9 @@
       </w:tcPr>
     </w:tblStylePr>
   </w:style>
-  <w:style w:type="table" w:styleId="MediumGrid3">
+  <w:style w:type="table" w:styleId="GradeMdia3">
     <w:name w:val="Medium Grid 3"/>
-    <w:basedOn w:val="TableNormal"/>
+    <w:basedOn w:val="Tabelanormal"/>
     <w:uiPriority w:val="69"/>
     <w:rsid w:val="00CB0664"/>
     <w:pPr>
@@ -8816,9 +9623,9 @@
       </w:tcPr>
     </w:tblStylePr>
   </w:style>
-  <w:style w:type="table" w:styleId="MediumGrid3-Accent1">
+  <w:style w:type="table" w:styleId="GradeMdia3-nfase1">
     <w:name w:val="Medium Grid 3 Accent 1"/>
-    <w:basedOn w:val="TableNormal"/>
+    <w:basedOn w:val="Tabelanormal"/>
     <w:uiPriority w:val="69"/>
     <w:rsid w:val="00CB0664"/>
     <w:pPr>
@@ -8957,9 +9764,9 @@
       </w:tcPr>
     </w:tblStylePr>
   </w:style>
-  <w:style w:type="table" w:styleId="MediumGrid3-Accent2">
+  <w:style w:type="table" w:styleId="GradeMdia3-nfase2">
     <w:name w:val="Medium Grid 3 Accent 2"/>
-    <w:basedOn w:val="TableNormal"/>
+    <w:basedOn w:val="Tabelanormal"/>
     <w:uiPriority w:val="69"/>
     <w:rsid w:val="00CB0664"/>
     <w:pPr>
@@ -9098,9 +9905,9 @@
       </w:tcPr>
     </w:tblStylePr>
   </w:style>
-  <w:style w:type="table" w:styleId="MediumGrid3-Accent3">
+  <w:style w:type="table" w:styleId="GradeMdia3-nfase3">
     <w:name w:val="Medium Grid 3 Accent 3"/>
-    <w:basedOn w:val="TableNormal"/>
+    <w:basedOn w:val="Tabelanormal"/>
     <w:uiPriority w:val="69"/>
     <w:rsid w:val="00CB0664"/>
     <w:pPr>
@@ -9239,9 +10046,9 @@
       </w:tcPr>
     </w:tblStylePr>
   </w:style>
-  <w:style w:type="table" w:styleId="MediumGrid3-Accent4">
+  <w:style w:type="table" w:styleId="GradeMdia3-nfase4">
     <w:name w:val="Medium Grid 3 Accent 4"/>
-    <w:basedOn w:val="TableNormal"/>
+    <w:basedOn w:val="Tabelanormal"/>
     <w:uiPriority w:val="69"/>
     <w:rsid w:val="00CB0664"/>
     <w:pPr>
@@ -9380,9 +10187,9 @@
       </w:tcPr>
     </w:tblStylePr>
   </w:style>
-  <w:style w:type="table" w:styleId="MediumGrid3-Accent5">
+  <w:style w:type="table" w:styleId="GradeMdia3-nfase5">
     <w:name w:val="Medium Grid 3 Accent 5"/>
-    <w:basedOn w:val="TableNormal"/>
+    <w:basedOn w:val="Tabelanormal"/>
     <w:uiPriority w:val="69"/>
     <w:rsid w:val="00CB0664"/>
     <w:pPr>
@@ -9521,9 +10328,9 @@
       </w:tcPr>
     </w:tblStylePr>
   </w:style>
-  <w:style w:type="table" w:styleId="MediumGrid3-Accent6">
+  <w:style w:type="table" w:styleId="GradeMdia3-nfase6">
     <w:name w:val="Medium Grid 3 Accent 6"/>
-    <w:basedOn w:val="TableNormal"/>
+    <w:basedOn w:val="Tabelanormal"/>
     <w:uiPriority w:val="69"/>
     <w:rsid w:val="00CB0664"/>
     <w:pPr>
@@ -9662,9 +10469,9 @@
       </w:tcPr>
     </w:tblStylePr>
   </w:style>
-  <w:style w:type="table" w:styleId="DarkList">
+  <w:style w:type="table" w:styleId="ListaEscura">
     <w:name w:val="Dark List"/>
-    <w:basedOn w:val="TableNormal"/>
+    <w:basedOn w:val="Tabelanormal"/>
     <w:uiPriority w:val="70"/>
     <w:rsid w:val="00CB0664"/>
     <w:pPr>
@@ -9776,9 +10583,9 @@
       </w:tcPr>
     </w:tblStylePr>
   </w:style>
-  <w:style w:type="table" w:styleId="DarkList-Accent1">
+  <w:style w:type="table" w:styleId="ListaEscura-nfase1">
     <w:name w:val="Dark List Accent 1"/>
-    <w:basedOn w:val="TableNormal"/>
+    <w:basedOn w:val="Tabelanormal"/>
     <w:uiPriority w:val="70"/>
     <w:rsid w:val="00CB0664"/>
     <w:pPr>
@@ -9890,9 +10697,9 @@
       </w:tcPr>
     </w:tblStylePr>
   </w:style>
-  <w:style w:type="table" w:styleId="DarkList-Accent2">
+  <w:style w:type="table" w:styleId="ListaEscura-nfase2">
     <w:name w:val="Dark List Accent 2"/>
-    <w:basedOn w:val="TableNormal"/>
+    <w:basedOn w:val="Tabelanormal"/>
     <w:uiPriority w:val="70"/>
     <w:rsid w:val="00CB0664"/>
     <w:pPr>
@@ -10004,9 +10811,9 @@
       </w:tcPr>
     </w:tblStylePr>
   </w:style>
-  <w:style w:type="table" w:styleId="DarkList-Accent3">
+  <w:style w:type="table" w:styleId="ListaEscura-nfase3">
     <w:name w:val="Dark List Accent 3"/>
-    <w:basedOn w:val="TableNormal"/>
+    <w:basedOn w:val="Tabelanormal"/>
     <w:uiPriority w:val="70"/>
     <w:rsid w:val="00CB0664"/>
     <w:pPr>
@@ -10118,9 +10925,9 @@
       </w:tcPr>
     </w:tblStylePr>
   </w:style>
-  <w:style w:type="table" w:styleId="DarkList-Accent4">
+  <w:style w:type="table" w:styleId="ListaEscura-nfase4">
     <w:name w:val="Dark List Accent 4"/>
-    <w:basedOn w:val="TableNormal"/>
+    <w:basedOn w:val="Tabelanormal"/>
     <w:uiPriority w:val="70"/>
     <w:rsid w:val="00CB0664"/>
     <w:pPr>
@@ -10232,9 +11039,9 @@
       </w:tcPr>
     </w:tblStylePr>
   </w:style>
-  <w:style w:type="table" w:styleId="DarkList-Accent5">
+  <w:style w:type="table" w:styleId="ListaEscura-nfase5">
     <w:name w:val="Dark List Accent 5"/>
-    <w:basedOn w:val="TableNormal"/>
+    <w:basedOn w:val="Tabelanormal"/>
     <w:uiPriority w:val="70"/>
     <w:rsid w:val="00CB0664"/>
     <w:pPr>
@@ -10346,9 +11153,9 @@
       </w:tcPr>
     </w:tblStylePr>
   </w:style>
-  <w:style w:type="table" w:styleId="DarkList-Accent6">
+  <w:style w:type="table" w:styleId="ListaEscura-nfase6">
     <w:name w:val="Dark List Accent 6"/>
-    <w:basedOn w:val="TableNormal"/>
+    <w:basedOn w:val="Tabelanormal"/>
     <w:uiPriority w:val="70"/>
     <w:rsid w:val="00CB0664"/>
     <w:pPr>
@@ -10460,9 +11267,9 @@
       </w:tcPr>
     </w:tblStylePr>
   </w:style>
-  <w:style w:type="table" w:styleId="ColorfulShading">
+  <w:style w:type="table" w:styleId="SombreamentoColorido">
     <w:name w:val="Colorful Shading"/>
-    <w:basedOn w:val="TableNormal"/>
+    <w:basedOn w:val="Tabelanormal"/>
     <w:uiPriority w:val="71"/>
     <w:rsid w:val="00CB0664"/>
     <w:pPr>
@@ -10582,9 +11389,9 @@
       </w:rPr>
     </w:tblStylePr>
   </w:style>
-  <w:style w:type="table" w:styleId="ColorfulShading-Accent1">
+  <w:style w:type="table" w:styleId="SombreamentoEscuro-nfase1">
     <w:name w:val="Colorful Shading Accent 1"/>
-    <w:basedOn w:val="TableNormal"/>
+    <w:basedOn w:val="Tabelanormal"/>
     <w:uiPriority w:val="71"/>
     <w:rsid w:val="00CB0664"/>
     <w:pPr>
@@ -10704,9 +11511,9 @@
       </w:rPr>
     </w:tblStylePr>
   </w:style>
-  <w:style w:type="table" w:styleId="ColorfulShading-Accent2">
+  <w:style w:type="table" w:styleId="SombreamentoColorido-nfase2">
     <w:name w:val="Colorful Shading Accent 2"/>
-    <w:basedOn w:val="TableNormal"/>
+    <w:basedOn w:val="Tabelanormal"/>
     <w:uiPriority w:val="71"/>
     <w:rsid w:val="00CB0664"/>
     <w:pPr>
@@ -10826,9 +11633,9 @@
       </w:rPr>
     </w:tblStylePr>
   </w:style>
-  <w:style w:type="table" w:styleId="ColorfulShading-Accent3">
+  <w:style w:type="table" w:styleId="SombreamentoColorido-nfase3">
     <w:name w:val="Colorful Shading Accent 3"/>
-    <w:basedOn w:val="TableNormal"/>
+    <w:basedOn w:val="Tabelanormal"/>
     <w:uiPriority w:val="71"/>
     <w:rsid w:val="00CB0664"/>
     <w:pPr>
@@ -10938,9 +11745,9 @@
       </w:tcPr>
     </w:tblStylePr>
   </w:style>
-  <w:style w:type="table" w:styleId="ColorfulShading-Accent4">
+  <w:style w:type="table" w:styleId="SombreamentoColorido-nfase4">
     <w:name w:val="Colorful Shading Accent 4"/>
-    <w:basedOn w:val="TableNormal"/>
+    <w:basedOn w:val="Tabelanormal"/>
     <w:uiPriority w:val="71"/>
     <w:rsid w:val="00CB0664"/>
     <w:pPr>
@@ -11060,9 +11867,9 @@
       </w:rPr>
     </w:tblStylePr>
   </w:style>
-  <w:style w:type="table" w:styleId="ColorfulShading-Accent5">
+  <w:style w:type="table" w:styleId="SombreamentoColorido-nfase5">
     <w:name w:val="Colorful Shading Accent 5"/>
-    <w:basedOn w:val="TableNormal"/>
+    <w:basedOn w:val="Tabelanormal"/>
     <w:uiPriority w:val="71"/>
     <w:rsid w:val="00CB0664"/>
     <w:pPr>
@@ -11182,9 +11989,9 @@
       </w:rPr>
     </w:tblStylePr>
   </w:style>
-  <w:style w:type="table" w:styleId="ColorfulShading-Accent6">
+  <w:style w:type="table" w:styleId="SombreamentoColorido-nfase6">
     <w:name w:val="Colorful Shading Accent 6"/>
-    <w:basedOn w:val="TableNormal"/>
+    <w:basedOn w:val="Tabelanormal"/>
     <w:uiPriority w:val="71"/>
     <w:rsid w:val="00CB0664"/>
     <w:pPr>
@@ -11304,9 +12111,9 @@
       </w:rPr>
     </w:tblStylePr>
   </w:style>
-  <w:style w:type="table" w:styleId="ColorfulList">
+  <w:style w:type="table" w:styleId="ListaColorida">
     <w:name w:val="Colorful List"/>
-    <w:basedOn w:val="TableNormal"/>
+    <w:basedOn w:val="Tabelanormal"/>
     <w:uiPriority w:val="72"/>
     <w:rsid w:val="00CB0664"/>
     <w:pPr>
@@ -11390,9 +12197,9 @@
       </w:tcPr>
     </w:tblStylePr>
   </w:style>
-  <w:style w:type="table" w:styleId="ColorfulList-Accent1">
+  <w:style w:type="table" w:styleId="ListaColorida-nfase1">
     <w:name w:val="Colorful List Accent 1"/>
-    <w:basedOn w:val="TableNormal"/>
+    <w:basedOn w:val="Tabelanormal"/>
     <w:uiPriority w:val="72"/>
     <w:rsid w:val="00CB0664"/>
     <w:pPr>
@@ -11476,9 +12283,9 @@
       </w:tcPr>
     </w:tblStylePr>
   </w:style>
-  <w:style w:type="table" w:styleId="ColorfulList-Accent2">
+  <w:style w:type="table" w:styleId="ListaColorida-nfase2">
     <w:name w:val="Colorful List Accent 2"/>
-    <w:basedOn w:val="TableNormal"/>
+    <w:basedOn w:val="Tabelanormal"/>
     <w:uiPriority w:val="72"/>
     <w:rsid w:val="00CB0664"/>
     <w:pPr>
@@ -11562,9 +12369,9 @@
       </w:tcPr>
     </w:tblStylePr>
   </w:style>
-  <w:style w:type="table" w:styleId="ColorfulList-Accent3">
+  <w:style w:type="table" w:styleId="ListaColorida-nfase3">
     <w:name w:val="Colorful List Accent 3"/>
-    <w:basedOn w:val="TableNormal"/>
+    <w:basedOn w:val="Tabelanormal"/>
     <w:uiPriority w:val="72"/>
     <w:rsid w:val="00CB0664"/>
     <w:pPr>
@@ -11648,9 +12455,9 @@
       </w:tcPr>
     </w:tblStylePr>
   </w:style>
-  <w:style w:type="table" w:styleId="ColorfulList-Accent4">
+  <w:style w:type="table" w:styleId="ListaColorida-nfase4">
     <w:name w:val="Colorful List Accent 4"/>
-    <w:basedOn w:val="TableNormal"/>
+    <w:basedOn w:val="Tabelanormal"/>
     <w:uiPriority w:val="72"/>
     <w:rsid w:val="00CB0664"/>
     <w:pPr>
@@ -11734,9 +12541,9 @@
       </w:tcPr>
     </w:tblStylePr>
   </w:style>
-  <w:style w:type="table" w:styleId="ColorfulList-Accent5">
+  <w:style w:type="table" w:styleId="ListaColorida-nfase5">
     <w:name w:val="Colorful List Accent 5"/>
-    <w:basedOn w:val="TableNormal"/>
+    <w:basedOn w:val="Tabelanormal"/>
     <w:uiPriority w:val="72"/>
     <w:rsid w:val="00CB0664"/>
     <w:pPr>
@@ -11820,9 +12627,9 @@
       </w:tcPr>
     </w:tblStylePr>
   </w:style>
-  <w:style w:type="table" w:styleId="ColorfulList-Accent6">
+  <w:style w:type="table" w:styleId="ListaColorida-nfase6">
     <w:name w:val="Colorful List Accent 6"/>
-    <w:basedOn w:val="TableNormal"/>
+    <w:basedOn w:val="Tabelanormal"/>
     <w:uiPriority w:val="72"/>
     <w:rsid w:val="00CB0664"/>
     <w:pPr>
@@ -11906,9 +12713,9 @@
       </w:tcPr>
     </w:tblStylePr>
   </w:style>
-  <w:style w:type="table" w:styleId="ColorfulGrid">
+  <w:style w:type="table" w:styleId="GradeColorida">
     <w:name w:val="Colorful Grid"/>
-    <w:basedOn w:val="TableNormal"/>
+    <w:basedOn w:val="Tabelanormal"/>
     <w:uiPriority w:val="73"/>
     <w:rsid w:val="00CB0664"/>
     <w:pPr>
@@ -11986,9 +12793,9 @@
       </w:tcPr>
     </w:tblStylePr>
   </w:style>
-  <w:style w:type="table" w:styleId="ColorfulGrid-Accent1">
+  <w:style w:type="table" w:styleId="GradeColorida-nfase1">
     <w:name w:val="Colorful Grid Accent 1"/>
-    <w:basedOn w:val="TableNormal"/>
+    <w:basedOn w:val="Tabelanormal"/>
     <w:uiPriority w:val="73"/>
     <w:rsid w:val="00CB0664"/>
     <w:pPr>
@@ -12066,9 +12873,9 @@
       </w:tcPr>
     </w:tblStylePr>
   </w:style>
-  <w:style w:type="table" w:styleId="ColorfulGrid-Accent2">
+  <w:style w:type="table" w:styleId="GradeColorida-nfase2">
     <w:name w:val="Colorful Grid Accent 2"/>
-    <w:basedOn w:val="TableNormal"/>
+    <w:basedOn w:val="Tabelanormal"/>
     <w:uiPriority w:val="73"/>
     <w:rsid w:val="00CB0664"/>
     <w:pPr>
@@ -12146,9 +12953,9 @@
       </w:tcPr>
     </w:tblStylePr>
   </w:style>
-  <w:style w:type="table" w:styleId="ColorfulGrid-Accent3">
+  <w:style w:type="table" w:styleId="GradeColorida-nfase3">
     <w:name w:val="Colorful Grid Accent 3"/>
-    <w:basedOn w:val="TableNormal"/>
+    <w:basedOn w:val="Tabelanormal"/>
     <w:uiPriority w:val="73"/>
     <w:rsid w:val="00CB0664"/>
     <w:pPr>
@@ -12226,9 +13033,9 @@
       </w:tcPr>
     </w:tblStylePr>
   </w:style>
-  <w:style w:type="table" w:styleId="ColorfulGrid-Accent4">
+  <w:style w:type="table" w:styleId="GradeColorida-nfase4">
     <w:name w:val="Colorful Grid Accent 4"/>
-    <w:basedOn w:val="TableNormal"/>
+    <w:basedOn w:val="Tabelanormal"/>
     <w:uiPriority w:val="73"/>
     <w:rsid w:val="00CB0664"/>
     <w:pPr>
@@ -12306,9 +13113,9 @@
       </w:tcPr>
     </w:tblStylePr>
   </w:style>
-  <w:style w:type="table" w:styleId="ColorfulGrid-Accent5">
+  <w:style w:type="table" w:styleId="GradeColorida-nfase5">
     <w:name w:val="Colorful Grid Accent 5"/>
-    <w:basedOn w:val="TableNormal"/>
+    <w:basedOn w:val="Tabelanormal"/>
     <w:uiPriority w:val="73"/>
     <w:rsid w:val="00CB0664"/>
     <w:pPr>
@@ -12386,9 +13193,9 @@
       </w:tcPr>
     </w:tblStylePr>
   </w:style>
-  <w:style w:type="table" w:styleId="ColorfulGrid-Accent6">
+  <w:style w:type="table" w:styleId="GradeColorida-nfase6">
     <w:name w:val="Colorful Grid Accent 6"/>
-    <w:basedOn w:val="TableNormal"/>
+    <w:basedOn w:val="Tabelanormal"/>
     <w:uiPriority w:val="73"/>
     <w:rsid w:val="00CB0664"/>
     <w:pPr>
@@ -24596,7 +25403,7 @@
 </file>
 
 <file path=customXml/itemProps1.xml><?xml version="1.0" encoding="utf-8"?>
-<ds:datastoreItem xmlns:ds="http://schemas.openxmlformats.org/officeDocument/2006/customXml" ds:itemID="{EF278816-EC6F-A645-907D-7F25AECB1D4A}">
+<ds:datastoreItem xmlns:ds="http://schemas.openxmlformats.org/officeDocument/2006/customXml" ds:itemID="{1D8C72A2-2624-4E5E-9D65-C1DACDC65679}">
   <ds:schemaRefs>
     <ds:schemaRef ds:uri="http://schemas.openxmlformats.org/officeDocument/2006/bibliography"/>
   </ds:schemaRefs>

</xml_diff>